<commit_message>
Tercer avance del sistema de reservas
Se colocó enlace de GitHub.
</commit_message>
<xml_diff>
--- a/Fase 4 - Componente práctico - Prácticas simuladas_Jose Gabriel Rodriguez Bonilla.docx
+++ b/Fase 4 - Componente práctico - Prácticas simuladas_Jose Gabriel Rodriguez Bonilla.docx
@@ -1068,27 +1068,7 @@
           <w:szCs w:val="20"/>
           <w:lang w:val="en-US"/>
         </w:rPr>
-        <w:t xml:space="preserve">with </w:t>
-      </w:r>
-      <w:proofErr w:type="gramStart"/>
-      <w:r>
-        <w:rPr>
-          <w:rFonts w:ascii="Courier New" w:hAnsi="Courier New" w:cs="Courier New"/>
-          <w:sz w:val="20"/>
-          <w:szCs w:val="20"/>
-          <w:lang w:val="en-US"/>
-        </w:rPr>
-        <w:t>open(</w:t>
-      </w:r>
-      <w:proofErr w:type="gramEnd"/>
-      <w:r>
-        <w:rPr>
-          <w:rFonts w:ascii="Courier New" w:hAnsi="Courier New" w:cs="Courier New"/>
-          <w:sz w:val="20"/>
-          <w:szCs w:val="20"/>
-          <w:lang w:val="en-US"/>
-        </w:rPr>
-        <w:t>"errores.log", "a") as archivo:</w:t>
+        <w:t>with open("errores.log", "a") as archivo:</w:t>
       </w:r>
     </w:p>
     <w:p>
@@ -1109,23 +1089,13 @@
         </w:rPr>
         <w:t xml:space="preserve">        </w:t>
       </w:r>
-      <w:proofErr w:type="gramStart"/>
-      <w:r>
-        <w:rPr>
-          <w:rFonts w:ascii="Courier New" w:hAnsi="Courier New" w:cs="Courier New"/>
-          <w:sz w:val="20"/>
-          <w:szCs w:val="20"/>
-        </w:rPr>
-        <w:t>archivo.write</w:t>
-      </w:r>
-      <w:proofErr w:type="gramEnd"/>
-      <w:r>
-        <w:rPr>
-          <w:rFonts w:ascii="Courier New" w:hAnsi="Courier New" w:cs="Courier New"/>
-          <w:sz w:val="20"/>
-          <w:szCs w:val="20"/>
-        </w:rPr>
-        <w:t>(mensaje + "\n")</w:t>
+      <w:r>
+        <w:rPr>
+          <w:rFonts w:ascii="Courier New" w:hAnsi="Courier New" w:cs="Courier New"/>
+          <w:sz w:val="20"/>
+          <w:szCs w:val="20"/>
+        </w:rPr>
+        <w:t>archivo.write(mensaje + "\n")</w:t>
       </w:r>
     </w:p>
     <w:p>
@@ -1201,27 +1171,7 @@
           <w:szCs w:val="20"/>
           <w:lang w:val="en-US"/>
         </w:rPr>
-        <w:t xml:space="preserve">class </w:t>
-      </w:r>
-      <w:proofErr w:type="gramStart"/>
-      <w:r>
-        <w:rPr>
-          <w:rFonts w:ascii="Courier New" w:hAnsi="Courier New" w:cs="Courier New"/>
-          <w:sz w:val="20"/>
-          <w:szCs w:val="20"/>
-          <w:lang w:val="en-US"/>
-        </w:rPr>
-        <w:t>ErrorCliente(</w:t>
-      </w:r>
-      <w:proofErr w:type="gramEnd"/>
-      <w:r>
-        <w:rPr>
-          <w:rFonts w:ascii="Courier New" w:hAnsi="Courier New" w:cs="Courier New"/>
-          <w:sz w:val="20"/>
-          <w:szCs w:val="20"/>
-          <w:lang w:val="en-US"/>
-        </w:rPr>
-        <w:t>Exception):</w:t>
+        <w:t>class ErrorCliente(Exception):</w:t>
       </w:r>
     </w:p>
     <w:p>
@@ -1261,27 +1211,7 @@
           <w:szCs w:val="20"/>
           <w:lang w:val="en-US"/>
         </w:rPr>
-        <w:t xml:space="preserve">class </w:t>
-      </w:r>
-      <w:proofErr w:type="gramStart"/>
-      <w:r>
-        <w:rPr>
-          <w:rFonts w:ascii="Courier New" w:hAnsi="Courier New" w:cs="Courier New"/>
-          <w:sz w:val="20"/>
-          <w:szCs w:val="20"/>
-          <w:lang w:val="en-US"/>
-        </w:rPr>
-        <w:t>ErrorServicio(</w:t>
-      </w:r>
-      <w:proofErr w:type="gramEnd"/>
-      <w:r>
-        <w:rPr>
-          <w:rFonts w:ascii="Courier New" w:hAnsi="Courier New" w:cs="Courier New"/>
-          <w:sz w:val="20"/>
-          <w:szCs w:val="20"/>
-          <w:lang w:val="en-US"/>
-        </w:rPr>
-        <w:t>Exception):</w:t>
+        <w:t>class ErrorServicio(Exception):</w:t>
       </w:r>
     </w:p>
     <w:p>
@@ -1321,27 +1251,7 @@
           <w:szCs w:val="20"/>
           <w:lang w:val="en-US"/>
         </w:rPr>
-        <w:t xml:space="preserve">class </w:t>
-      </w:r>
-      <w:proofErr w:type="gramStart"/>
-      <w:r>
-        <w:rPr>
-          <w:rFonts w:ascii="Courier New" w:hAnsi="Courier New" w:cs="Courier New"/>
-          <w:sz w:val="20"/>
-          <w:szCs w:val="20"/>
-          <w:lang w:val="en-US"/>
-        </w:rPr>
-        <w:t>ErrorReserva(</w:t>
-      </w:r>
-      <w:proofErr w:type="gramEnd"/>
-      <w:r>
-        <w:rPr>
-          <w:rFonts w:ascii="Courier New" w:hAnsi="Courier New" w:cs="Courier New"/>
-          <w:sz w:val="20"/>
-          <w:szCs w:val="20"/>
-          <w:lang w:val="en-US"/>
-        </w:rPr>
-        <w:t>Exception):</w:t>
+        <w:t>class ErrorReserva(Exception):</w:t>
       </w:r>
     </w:p>
     <w:p>
@@ -1448,67 +1358,27 @@
           <w:lang w:val="en-US"/>
         </w:rPr>
         <w:lastRenderedPageBreak/>
-        <w:t xml:space="preserve">class </w:t>
-      </w:r>
-      <w:proofErr w:type="gramStart"/>
-      <w:r>
-        <w:rPr>
-          <w:rFonts w:ascii="Courier New" w:hAnsi="Courier New" w:cs="Courier New"/>
-          <w:sz w:val="20"/>
-          <w:szCs w:val="20"/>
-          <w:lang w:val="en-US"/>
-        </w:rPr>
-        <w:t>Entidad(</w:t>
-      </w:r>
-      <w:proofErr w:type="gramEnd"/>
-      <w:r>
-        <w:rPr>
-          <w:rFonts w:ascii="Courier New" w:hAnsi="Courier New" w:cs="Courier New"/>
-          <w:sz w:val="20"/>
-          <w:szCs w:val="20"/>
-          <w:lang w:val="en-US"/>
-        </w:rPr>
-        <w:t>ABC):</w:t>
-      </w:r>
-    </w:p>
-    <w:p>
-      <w:pPr>
-        <w:spacing w:line="480" w:lineRule="auto"/>
-        <w:rPr>
-          <w:rFonts w:ascii="Courier New" w:hAnsi="Courier New" w:cs="Courier New"/>
-          <w:sz w:val="20"/>
-          <w:szCs w:val="20"/>
-          <w:lang w:val="en-US"/>
-        </w:rPr>
-      </w:pPr>
-      <w:r>
-        <w:rPr>
-          <w:rFonts w:ascii="Courier New" w:hAnsi="Courier New" w:cs="Courier New"/>
-          <w:sz w:val="20"/>
-          <w:szCs w:val="20"/>
-          <w:lang w:val="en-US"/>
-        </w:rPr>
-        <w:t>    def __init_</w:t>
-      </w:r>
-      <w:proofErr w:type="gramStart"/>
-      <w:r>
-        <w:rPr>
-          <w:rFonts w:ascii="Courier New" w:hAnsi="Courier New" w:cs="Courier New"/>
-          <w:sz w:val="20"/>
-          <w:szCs w:val="20"/>
-          <w:lang w:val="en-US"/>
-        </w:rPr>
-        <w:t>_(</w:t>
-      </w:r>
-      <w:proofErr w:type="gramEnd"/>
-      <w:r>
-        <w:rPr>
-          <w:rFonts w:ascii="Courier New" w:hAnsi="Courier New" w:cs="Courier New"/>
-          <w:sz w:val="20"/>
-          <w:szCs w:val="20"/>
-          <w:lang w:val="en-US"/>
-        </w:rPr>
-        <w:t>self, nombre):</w:t>
+        <w:t>class Entidad(ABC):</w:t>
+      </w:r>
+    </w:p>
+    <w:p>
+      <w:pPr>
+        <w:spacing w:line="480" w:lineRule="auto"/>
+        <w:rPr>
+          <w:rFonts w:ascii="Courier New" w:hAnsi="Courier New" w:cs="Courier New"/>
+          <w:sz w:val="20"/>
+          <w:szCs w:val="20"/>
+          <w:lang w:val="en-US"/>
+        </w:rPr>
+      </w:pPr>
+      <w:r>
+        <w:rPr>
+          <w:rFonts w:ascii="Courier New" w:hAnsi="Courier New" w:cs="Courier New"/>
+          <w:sz w:val="20"/>
+          <w:szCs w:val="20"/>
+          <w:lang w:val="en-US"/>
+        </w:rPr>
+        <w:t>    def __init__(self, nombre):</w:t>
       </w:r>
     </w:p>
     <w:p>
@@ -1529,23 +1399,13 @@
         </w:rPr>
         <w:t xml:space="preserve">        </w:t>
       </w:r>
-      <w:proofErr w:type="gramStart"/>
-      <w:r>
-        <w:rPr>
-          <w:rFonts w:ascii="Courier New" w:hAnsi="Courier New" w:cs="Courier New"/>
-          <w:sz w:val="20"/>
-          <w:szCs w:val="20"/>
-        </w:rPr>
-        <w:t>self._</w:t>
-      </w:r>
-      <w:proofErr w:type="gramEnd"/>
-      <w:r>
-        <w:rPr>
-          <w:rFonts w:ascii="Courier New" w:hAnsi="Courier New" w:cs="Courier New"/>
-          <w:sz w:val="20"/>
-          <w:szCs w:val="20"/>
-        </w:rPr>
-        <w:t>nombre = nombre</w:t>
+      <w:r>
+        <w:rPr>
+          <w:rFonts w:ascii="Courier New" w:hAnsi="Courier New" w:cs="Courier New"/>
+          <w:sz w:val="20"/>
+          <w:szCs w:val="20"/>
+        </w:rPr>
+        <w:t>self._nombre = nombre</w:t>
       </w:r>
     </w:p>
     <w:p>
@@ -1619,147 +1479,67 @@
           <w:szCs w:val="20"/>
           <w:lang w:val="en-US"/>
         </w:rPr>
-        <w:t xml:space="preserve">class </w:t>
-      </w:r>
-      <w:proofErr w:type="gramStart"/>
-      <w:r>
-        <w:rPr>
-          <w:rFonts w:ascii="Courier New" w:hAnsi="Courier New" w:cs="Courier New"/>
-          <w:sz w:val="20"/>
-          <w:szCs w:val="20"/>
-          <w:lang w:val="en-US"/>
-        </w:rPr>
-        <w:t>Cliente(</w:t>
-      </w:r>
-      <w:proofErr w:type="gramEnd"/>
-      <w:r>
-        <w:rPr>
-          <w:rFonts w:ascii="Courier New" w:hAnsi="Courier New" w:cs="Courier New"/>
-          <w:sz w:val="20"/>
-          <w:szCs w:val="20"/>
-          <w:lang w:val="en-US"/>
-        </w:rPr>
-        <w:t>Entidad):</w:t>
-      </w:r>
-    </w:p>
-    <w:p>
-      <w:pPr>
-        <w:spacing w:line="480" w:lineRule="auto"/>
-        <w:rPr>
-          <w:rFonts w:ascii="Courier New" w:hAnsi="Courier New" w:cs="Courier New"/>
-          <w:sz w:val="20"/>
-          <w:szCs w:val="20"/>
-          <w:lang w:val="en-US"/>
-        </w:rPr>
-      </w:pPr>
-      <w:r>
-        <w:rPr>
-          <w:rFonts w:ascii="Courier New" w:hAnsi="Courier New" w:cs="Courier New"/>
-          <w:sz w:val="20"/>
-          <w:szCs w:val="20"/>
-          <w:lang w:val="en-US"/>
-        </w:rPr>
-        <w:t>    def __init_</w:t>
-      </w:r>
-      <w:proofErr w:type="gramStart"/>
-      <w:r>
-        <w:rPr>
-          <w:rFonts w:ascii="Courier New" w:hAnsi="Courier New" w:cs="Courier New"/>
-          <w:sz w:val="20"/>
-          <w:szCs w:val="20"/>
-          <w:lang w:val="en-US"/>
-        </w:rPr>
-        <w:t>_(</w:t>
-      </w:r>
-      <w:proofErr w:type="gramEnd"/>
-      <w:r>
-        <w:rPr>
-          <w:rFonts w:ascii="Courier New" w:hAnsi="Courier New" w:cs="Courier New"/>
-          <w:sz w:val="20"/>
-          <w:szCs w:val="20"/>
-          <w:lang w:val="en-US"/>
-        </w:rPr>
-        <w:t>self, nombre, correo):</w:t>
-      </w:r>
-    </w:p>
-    <w:p>
-      <w:pPr>
-        <w:spacing w:line="480" w:lineRule="auto"/>
-        <w:rPr>
-          <w:rFonts w:ascii="Courier New" w:hAnsi="Courier New" w:cs="Courier New"/>
-          <w:sz w:val="20"/>
-          <w:szCs w:val="20"/>
-          <w:lang w:val="en-US"/>
-        </w:rPr>
-      </w:pPr>
-      <w:r>
-        <w:rPr>
-          <w:rFonts w:ascii="Courier New" w:hAnsi="Courier New" w:cs="Courier New"/>
-          <w:sz w:val="20"/>
-          <w:szCs w:val="20"/>
-          <w:lang w:val="en-US"/>
-        </w:rPr>
-        <w:t>        super(</w:t>
-      </w:r>
-      <w:proofErr w:type="gramStart"/>
-      <w:r>
-        <w:rPr>
-          <w:rFonts w:ascii="Courier New" w:hAnsi="Courier New" w:cs="Courier New"/>
-          <w:sz w:val="20"/>
-          <w:szCs w:val="20"/>
-          <w:lang w:val="en-US"/>
-        </w:rPr>
-        <w:t>)._</w:t>
-      </w:r>
-      <w:proofErr w:type="gramEnd"/>
-      <w:r>
-        <w:rPr>
-          <w:rFonts w:ascii="Courier New" w:hAnsi="Courier New" w:cs="Courier New"/>
-          <w:sz w:val="20"/>
-          <w:szCs w:val="20"/>
-          <w:lang w:val="en-US"/>
-        </w:rPr>
-        <w:t>_init__(nombre)</w:t>
-      </w:r>
-    </w:p>
-    <w:p>
-      <w:pPr>
-        <w:spacing w:line="480" w:lineRule="auto"/>
-        <w:rPr>
-          <w:rFonts w:ascii="Courier New" w:hAnsi="Courier New" w:cs="Courier New"/>
-          <w:sz w:val="20"/>
-          <w:szCs w:val="20"/>
-          <w:lang w:val="en-US"/>
-        </w:rPr>
-      </w:pPr>
-      <w:r>
-        <w:rPr>
-          <w:rFonts w:ascii="Courier New" w:hAnsi="Courier New" w:cs="Courier New"/>
-          <w:sz w:val="20"/>
-          <w:szCs w:val="20"/>
-          <w:lang w:val="en-US"/>
-        </w:rPr>
-        <w:t xml:space="preserve">        </w:t>
-      </w:r>
-      <w:proofErr w:type="gramStart"/>
-      <w:r>
-        <w:rPr>
-          <w:rFonts w:ascii="Courier New" w:hAnsi="Courier New" w:cs="Courier New"/>
-          <w:sz w:val="20"/>
-          <w:szCs w:val="20"/>
-          <w:lang w:val="en-US"/>
-        </w:rPr>
-        <w:t>if "@</w:t>
-      </w:r>
-      <w:proofErr w:type="gramEnd"/>
-      <w:r>
-        <w:rPr>
-          <w:rFonts w:ascii="Courier New" w:hAnsi="Courier New" w:cs="Courier New"/>
-          <w:sz w:val="20"/>
-          <w:szCs w:val="20"/>
-          <w:lang w:val="en-US"/>
-        </w:rPr>
-        <w:t>" not in correo:</w:t>
+        <w:t>class Cliente(Entidad):</w:t>
+      </w:r>
+    </w:p>
+    <w:p>
+      <w:pPr>
+        <w:spacing w:line="480" w:lineRule="auto"/>
+        <w:rPr>
+          <w:rFonts w:ascii="Courier New" w:hAnsi="Courier New" w:cs="Courier New"/>
+          <w:sz w:val="20"/>
+          <w:szCs w:val="20"/>
+          <w:lang w:val="en-US"/>
+        </w:rPr>
+      </w:pPr>
+      <w:r>
+        <w:rPr>
+          <w:rFonts w:ascii="Courier New" w:hAnsi="Courier New" w:cs="Courier New"/>
+          <w:sz w:val="20"/>
+          <w:szCs w:val="20"/>
+          <w:lang w:val="en-US"/>
+        </w:rPr>
+        <w:t>    def __init__(self, nombre, correo):</w:t>
+      </w:r>
+    </w:p>
+    <w:p>
+      <w:pPr>
+        <w:spacing w:line="480" w:lineRule="auto"/>
+        <w:rPr>
+          <w:rFonts w:ascii="Courier New" w:hAnsi="Courier New" w:cs="Courier New"/>
+          <w:sz w:val="20"/>
+          <w:szCs w:val="20"/>
+          <w:lang w:val="en-US"/>
+        </w:rPr>
+      </w:pPr>
+      <w:r>
+        <w:rPr>
+          <w:rFonts w:ascii="Courier New" w:hAnsi="Courier New" w:cs="Courier New"/>
+          <w:sz w:val="20"/>
+          <w:szCs w:val="20"/>
+          <w:lang w:val="en-US"/>
+        </w:rPr>
+        <w:t>        super().__init__(nombre)</w:t>
+      </w:r>
+    </w:p>
+    <w:p>
+      <w:pPr>
+        <w:spacing w:line="480" w:lineRule="auto"/>
+        <w:rPr>
+          <w:rFonts w:ascii="Courier New" w:hAnsi="Courier New" w:cs="Courier New"/>
+          <w:sz w:val="20"/>
+          <w:szCs w:val="20"/>
+          <w:lang w:val="en-US"/>
+        </w:rPr>
+      </w:pPr>
+      <w:r>
+        <w:rPr>
+          <w:rFonts w:ascii="Courier New" w:hAnsi="Courier New" w:cs="Courier New"/>
+          <w:sz w:val="20"/>
+          <w:szCs w:val="20"/>
+          <w:lang w:val="en-US"/>
+        </w:rPr>
+        <w:t>        if "@" not in correo:</w:t>
       </w:r>
     </w:p>
     <w:p>
@@ -1786,61 +1566,25 @@
           <w:sz w:val="20"/>
           <w:szCs w:val="20"/>
         </w:rPr>
-        <w:t xml:space="preserve">raise </w:t>
-      </w:r>
-      <w:proofErr w:type="gramStart"/>
-      <w:r>
-        <w:rPr>
-          <w:rFonts w:ascii="Courier New" w:hAnsi="Courier New" w:cs="Courier New"/>
-          <w:sz w:val="20"/>
-          <w:szCs w:val="20"/>
-        </w:rPr>
-        <w:t>ErrorCliente(</w:t>
-      </w:r>
-      <w:proofErr w:type="gramEnd"/>
-      <w:r>
-        <w:rPr>
-          <w:rFonts w:ascii="Courier New" w:hAnsi="Courier New" w:cs="Courier New"/>
-          <w:sz w:val="20"/>
-          <w:szCs w:val="20"/>
-        </w:rPr>
-        <w:t>"Correo inválido")</w:t>
-      </w:r>
-    </w:p>
-    <w:p>
-      <w:pPr>
-        <w:spacing w:line="480" w:lineRule="auto"/>
-        <w:rPr>
-          <w:rFonts w:ascii="Courier New" w:hAnsi="Courier New" w:cs="Courier New"/>
-          <w:sz w:val="20"/>
-          <w:szCs w:val="20"/>
-        </w:rPr>
-      </w:pPr>
-      <w:r>
-        <w:rPr>
-          <w:rFonts w:ascii="Courier New" w:hAnsi="Courier New" w:cs="Courier New"/>
-          <w:sz w:val="20"/>
-          <w:szCs w:val="20"/>
-        </w:rPr>
-        <w:t xml:space="preserve">        </w:t>
-      </w:r>
-      <w:proofErr w:type="gramStart"/>
-      <w:r>
-        <w:rPr>
-          <w:rFonts w:ascii="Courier New" w:hAnsi="Courier New" w:cs="Courier New"/>
-          <w:sz w:val="20"/>
-          <w:szCs w:val="20"/>
-        </w:rPr>
-        <w:t>self._</w:t>
-      </w:r>
-      <w:proofErr w:type="gramEnd"/>
-      <w:r>
-        <w:rPr>
-          <w:rFonts w:ascii="Courier New" w:hAnsi="Courier New" w:cs="Courier New"/>
-          <w:sz w:val="20"/>
-          <w:szCs w:val="20"/>
-        </w:rPr>
-        <w:t>correo = correo</w:t>
+        <w:t>raise ErrorCliente("Correo inválido")</w:t>
+      </w:r>
+    </w:p>
+    <w:p>
+      <w:pPr>
+        <w:spacing w:line="480" w:lineRule="auto"/>
+        <w:rPr>
+          <w:rFonts w:ascii="Courier New" w:hAnsi="Courier New" w:cs="Courier New"/>
+          <w:sz w:val="20"/>
+          <w:szCs w:val="20"/>
+        </w:rPr>
+      </w:pPr>
+      <w:r>
+        <w:rPr>
+          <w:rFonts w:ascii="Courier New" w:hAnsi="Courier New" w:cs="Courier New"/>
+          <w:sz w:val="20"/>
+          <w:szCs w:val="20"/>
+        </w:rPr>
+        <w:t>        self._correo = correo</w:t>
       </w:r>
     </w:p>
     <w:p>
@@ -1888,19 +1632,8 @@
           <w:szCs w:val="20"/>
           <w:lang w:val="en-US"/>
         </w:rPr>
-        <w:t>        return f"</w:t>
-      </w:r>
-      <w:proofErr w:type="gramStart"/>
-      <w:r>
-        <w:rPr>
-          <w:rFonts w:ascii="Courier New" w:hAnsi="Courier New" w:cs="Courier New"/>
-          <w:sz w:val="20"/>
-          <w:szCs w:val="20"/>
-          <w:lang w:val="en-US"/>
-        </w:rPr>
-        <w:t>Cliente: {self._nombre} - {self._correo}"</w:t>
-      </w:r>
-      <w:proofErr w:type="gramEnd"/>
+        <w:t>        return f"Cliente: {self._nombre} - {self._correo}"</w:t>
+      </w:r>
     </w:p>
     <w:p>
       <w:pPr>
@@ -1971,25 +1704,7 @@
           <w:sz w:val="20"/>
           <w:szCs w:val="20"/>
         </w:rPr>
-        <w:t xml:space="preserve">class </w:t>
-      </w:r>
-      <w:proofErr w:type="gramStart"/>
-      <w:r>
-        <w:rPr>
-          <w:rFonts w:ascii="Courier New" w:hAnsi="Courier New" w:cs="Courier New"/>
-          <w:sz w:val="20"/>
-          <w:szCs w:val="20"/>
-        </w:rPr>
-        <w:t>Servicio(</w:t>
-      </w:r>
-      <w:proofErr w:type="gramEnd"/>
-      <w:r>
-        <w:rPr>
-          <w:rFonts w:ascii="Courier New" w:hAnsi="Courier New" w:cs="Courier New"/>
-          <w:sz w:val="20"/>
-          <w:szCs w:val="20"/>
-        </w:rPr>
-        <w:t>ABC):</w:t>
+        <w:t>class Servicio(ABC):</w:t>
       </w:r>
     </w:p>
     <w:p>
@@ -2186,25 +1901,7 @@
           <w:sz w:val="20"/>
           <w:szCs w:val="20"/>
         </w:rPr>
-        <w:t xml:space="preserve">class </w:t>
-      </w:r>
-      <w:proofErr w:type="gramStart"/>
-      <w:r>
-        <w:rPr>
-          <w:rFonts w:ascii="Courier New" w:hAnsi="Courier New" w:cs="Courier New"/>
-          <w:sz w:val="20"/>
-          <w:szCs w:val="20"/>
-        </w:rPr>
-        <w:t>ReservaSala(</w:t>
-      </w:r>
-      <w:proofErr w:type="gramEnd"/>
-      <w:r>
-        <w:rPr>
-          <w:rFonts w:ascii="Courier New" w:hAnsi="Courier New" w:cs="Courier New"/>
-          <w:sz w:val="20"/>
-          <w:szCs w:val="20"/>
-        </w:rPr>
-        <w:t>Servicio):</w:t>
+        <w:t>class ReservaSala(Servicio):</w:t>
       </w:r>
     </w:p>
     <w:p>
@@ -2230,25 +1927,7 @@
           <w:sz w:val="20"/>
           <w:szCs w:val="20"/>
         </w:rPr>
-        <w:t>def __init_</w:t>
-      </w:r>
-      <w:proofErr w:type="gramStart"/>
-      <w:r>
-        <w:rPr>
-          <w:rFonts w:ascii="Courier New" w:hAnsi="Courier New" w:cs="Courier New"/>
-          <w:sz w:val="20"/>
-          <w:szCs w:val="20"/>
-        </w:rPr>
-        <w:t>_(</w:t>
-      </w:r>
-      <w:proofErr w:type="gramEnd"/>
-      <w:r>
-        <w:rPr>
-          <w:rFonts w:ascii="Courier New" w:hAnsi="Courier New" w:cs="Courier New"/>
-          <w:sz w:val="20"/>
-          <w:szCs w:val="20"/>
-        </w:rPr>
-        <w:t>self, horas):</w:t>
+        <w:t>def __init__(self, horas):</w:t>
       </w:r>
     </w:p>
     <w:p>
@@ -2292,61 +1971,25 @@
           <w:sz w:val="20"/>
           <w:szCs w:val="20"/>
         </w:rPr>
-        <w:t xml:space="preserve">raise </w:t>
-      </w:r>
-      <w:proofErr w:type="gramStart"/>
-      <w:r>
-        <w:rPr>
-          <w:rFonts w:ascii="Courier New" w:hAnsi="Courier New" w:cs="Courier New"/>
-          <w:sz w:val="20"/>
-          <w:szCs w:val="20"/>
-        </w:rPr>
-        <w:t>ErrorServicio(</w:t>
-      </w:r>
-      <w:proofErr w:type="gramEnd"/>
-      <w:r>
-        <w:rPr>
-          <w:rFonts w:ascii="Courier New" w:hAnsi="Courier New" w:cs="Courier New"/>
-          <w:sz w:val="20"/>
-          <w:szCs w:val="20"/>
-        </w:rPr>
-        <w:t>"Horas inválidas")</w:t>
-      </w:r>
-    </w:p>
-    <w:p>
-      <w:pPr>
-        <w:spacing w:line="480" w:lineRule="auto"/>
-        <w:rPr>
-          <w:rFonts w:ascii="Courier New" w:hAnsi="Courier New" w:cs="Courier New"/>
-          <w:sz w:val="20"/>
-          <w:szCs w:val="20"/>
-        </w:rPr>
-      </w:pPr>
-      <w:r>
-        <w:rPr>
-          <w:rFonts w:ascii="Courier New" w:hAnsi="Courier New" w:cs="Courier New"/>
-          <w:sz w:val="20"/>
-          <w:szCs w:val="20"/>
-        </w:rPr>
-        <w:t xml:space="preserve">        </w:t>
-      </w:r>
-      <w:proofErr w:type="gramStart"/>
-      <w:r>
-        <w:rPr>
-          <w:rFonts w:ascii="Courier New" w:hAnsi="Courier New" w:cs="Courier New"/>
-          <w:sz w:val="20"/>
-          <w:szCs w:val="20"/>
-        </w:rPr>
-        <w:t>self._</w:t>
-      </w:r>
-      <w:proofErr w:type="gramEnd"/>
-      <w:r>
-        <w:rPr>
-          <w:rFonts w:ascii="Courier New" w:hAnsi="Courier New" w:cs="Courier New"/>
-          <w:sz w:val="20"/>
-          <w:szCs w:val="20"/>
-        </w:rPr>
-        <w:t>horas = horas</w:t>
+        <w:t>raise ErrorServicio("Horas inválidas")</w:t>
+      </w:r>
+    </w:p>
+    <w:p>
+      <w:pPr>
+        <w:spacing w:line="480" w:lineRule="auto"/>
+        <w:rPr>
+          <w:rFonts w:ascii="Courier New" w:hAnsi="Courier New" w:cs="Courier New"/>
+          <w:sz w:val="20"/>
+          <w:szCs w:val="20"/>
+        </w:rPr>
+      </w:pPr>
+      <w:r>
+        <w:rPr>
+          <w:rFonts w:ascii="Courier New" w:hAnsi="Courier New" w:cs="Courier New"/>
+          <w:sz w:val="20"/>
+          <w:szCs w:val="20"/>
+        </w:rPr>
+        <w:t>        self._horas = horas</w:t>
       </w:r>
     </w:p>
     <w:p>
@@ -2382,25 +2025,7 @@
           <w:sz w:val="20"/>
           <w:szCs w:val="20"/>
         </w:rPr>
-        <w:t xml:space="preserve">        return </w:t>
-      </w:r>
-      <w:proofErr w:type="gramStart"/>
-      <w:r>
-        <w:rPr>
-          <w:rFonts w:ascii="Courier New" w:hAnsi="Courier New" w:cs="Courier New"/>
-          <w:sz w:val="20"/>
-          <w:szCs w:val="20"/>
-        </w:rPr>
-        <w:t>self._</w:t>
-      </w:r>
-      <w:proofErr w:type="gramEnd"/>
-      <w:r>
-        <w:rPr>
-          <w:rFonts w:ascii="Courier New" w:hAnsi="Courier New" w:cs="Courier New"/>
-          <w:sz w:val="20"/>
-          <w:szCs w:val="20"/>
-        </w:rPr>
-        <w:t>horas * 50000</w:t>
+        <w:t>        return self._horas * 50000</w:t>
       </w:r>
     </w:p>
     <w:p>
@@ -2436,97 +2061,43 @@
           <w:sz w:val="20"/>
           <w:szCs w:val="20"/>
         </w:rPr>
-        <w:t>        return f"Reserva de sala por {</w:t>
-      </w:r>
-      <w:proofErr w:type="gramStart"/>
-      <w:r>
-        <w:rPr>
-          <w:rFonts w:ascii="Courier New" w:hAnsi="Courier New" w:cs="Courier New"/>
-          <w:sz w:val="20"/>
-          <w:szCs w:val="20"/>
-        </w:rPr>
-        <w:t>self._</w:t>
-      </w:r>
-      <w:proofErr w:type="gramEnd"/>
-      <w:r>
-        <w:rPr>
-          <w:rFonts w:ascii="Courier New" w:hAnsi="Courier New" w:cs="Courier New"/>
-          <w:sz w:val="20"/>
-          <w:szCs w:val="20"/>
-        </w:rPr>
-        <w:t>horas} horas"</w:t>
-      </w:r>
-    </w:p>
-    <w:p>
-      <w:pPr>
-        <w:spacing w:line="480" w:lineRule="auto"/>
-        <w:rPr>
-          <w:rFonts w:ascii="Courier New" w:hAnsi="Courier New" w:cs="Courier New"/>
-          <w:sz w:val="20"/>
-          <w:szCs w:val="20"/>
-        </w:rPr>
-      </w:pPr>
-      <w:r>
-        <w:rPr>
-          <w:rFonts w:ascii="Courier New" w:hAnsi="Courier New" w:cs="Courier New"/>
-          <w:sz w:val="20"/>
-          <w:szCs w:val="20"/>
-        </w:rPr>
-        <w:t xml:space="preserve">class </w:t>
-      </w:r>
-      <w:proofErr w:type="gramStart"/>
-      <w:r>
-        <w:rPr>
-          <w:rFonts w:ascii="Courier New" w:hAnsi="Courier New" w:cs="Courier New"/>
-          <w:sz w:val="20"/>
-          <w:szCs w:val="20"/>
-        </w:rPr>
-        <w:t>AlquilerEquipo(</w:t>
-      </w:r>
-      <w:proofErr w:type="gramEnd"/>
-      <w:r>
-        <w:rPr>
-          <w:rFonts w:ascii="Courier New" w:hAnsi="Courier New" w:cs="Courier New"/>
-          <w:sz w:val="20"/>
-          <w:szCs w:val="20"/>
-        </w:rPr>
-        <w:t>Servicio):</w:t>
-      </w:r>
-    </w:p>
-    <w:p>
-      <w:pPr>
-        <w:spacing w:line="480" w:lineRule="auto"/>
-        <w:rPr>
-          <w:rFonts w:ascii="Courier New" w:hAnsi="Courier New" w:cs="Courier New"/>
-          <w:sz w:val="20"/>
-          <w:szCs w:val="20"/>
-        </w:rPr>
-      </w:pPr>
-      <w:r>
-        <w:rPr>
-          <w:rFonts w:ascii="Courier New" w:hAnsi="Courier New" w:cs="Courier New"/>
-          <w:sz w:val="20"/>
-          <w:szCs w:val="20"/>
-        </w:rPr>
-        <w:t>    def __init_</w:t>
-      </w:r>
-      <w:proofErr w:type="gramStart"/>
-      <w:r>
-        <w:rPr>
-          <w:rFonts w:ascii="Courier New" w:hAnsi="Courier New" w:cs="Courier New"/>
-          <w:sz w:val="20"/>
-          <w:szCs w:val="20"/>
-        </w:rPr>
-        <w:t>_(</w:t>
-      </w:r>
-      <w:proofErr w:type="gramEnd"/>
-      <w:r>
-        <w:rPr>
-          <w:rFonts w:ascii="Courier New" w:hAnsi="Courier New" w:cs="Courier New"/>
-          <w:sz w:val="20"/>
-          <w:szCs w:val="20"/>
-        </w:rPr>
-        <w:t>self, dias):</w:t>
+        <w:t>        return f"Reserva de sala por {self._horas} horas"</w:t>
+      </w:r>
+    </w:p>
+    <w:p>
+      <w:pPr>
+        <w:spacing w:line="480" w:lineRule="auto"/>
+        <w:rPr>
+          <w:rFonts w:ascii="Courier New" w:hAnsi="Courier New" w:cs="Courier New"/>
+          <w:sz w:val="20"/>
+          <w:szCs w:val="20"/>
+        </w:rPr>
+      </w:pPr>
+      <w:r>
+        <w:rPr>
+          <w:rFonts w:ascii="Courier New" w:hAnsi="Courier New" w:cs="Courier New"/>
+          <w:sz w:val="20"/>
+          <w:szCs w:val="20"/>
+        </w:rPr>
+        <w:t>class AlquilerEquipo(Servicio):</w:t>
+      </w:r>
+    </w:p>
+    <w:p>
+      <w:pPr>
+        <w:spacing w:line="480" w:lineRule="auto"/>
+        <w:rPr>
+          <w:rFonts w:ascii="Courier New" w:hAnsi="Courier New" w:cs="Courier New"/>
+          <w:sz w:val="20"/>
+          <w:szCs w:val="20"/>
+        </w:rPr>
+      </w:pPr>
+      <w:r>
+        <w:rPr>
+          <w:rFonts w:ascii="Courier New" w:hAnsi="Courier New" w:cs="Courier New"/>
+          <w:sz w:val="20"/>
+          <w:szCs w:val="20"/>
+        </w:rPr>
+        <w:t>    def __init__(self, dias):</w:t>
       </w:r>
     </w:p>
     <w:p>
@@ -2562,61 +2133,25 @@
           <w:sz w:val="20"/>
           <w:szCs w:val="20"/>
         </w:rPr>
-        <w:t xml:space="preserve">            raise </w:t>
-      </w:r>
-      <w:proofErr w:type="gramStart"/>
-      <w:r>
-        <w:rPr>
-          <w:rFonts w:ascii="Courier New" w:hAnsi="Courier New" w:cs="Courier New"/>
-          <w:sz w:val="20"/>
-          <w:szCs w:val="20"/>
-        </w:rPr>
-        <w:t>ErrorServicio(</w:t>
-      </w:r>
-      <w:proofErr w:type="gramEnd"/>
-      <w:r>
-        <w:rPr>
-          <w:rFonts w:ascii="Courier New" w:hAnsi="Courier New" w:cs="Courier New"/>
-          <w:sz w:val="20"/>
-          <w:szCs w:val="20"/>
-        </w:rPr>
-        <w:t>"Días inválidos")</w:t>
-      </w:r>
-    </w:p>
-    <w:p>
-      <w:pPr>
-        <w:spacing w:line="480" w:lineRule="auto"/>
-        <w:rPr>
-          <w:rFonts w:ascii="Courier New" w:hAnsi="Courier New" w:cs="Courier New"/>
-          <w:sz w:val="20"/>
-          <w:szCs w:val="20"/>
-        </w:rPr>
-      </w:pPr>
-      <w:r>
-        <w:rPr>
-          <w:rFonts w:ascii="Courier New" w:hAnsi="Courier New" w:cs="Courier New"/>
-          <w:sz w:val="20"/>
-          <w:szCs w:val="20"/>
-        </w:rPr>
-        <w:t xml:space="preserve">        </w:t>
-      </w:r>
-      <w:proofErr w:type="gramStart"/>
-      <w:r>
-        <w:rPr>
-          <w:rFonts w:ascii="Courier New" w:hAnsi="Courier New" w:cs="Courier New"/>
-          <w:sz w:val="20"/>
-          <w:szCs w:val="20"/>
-        </w:rPr>
-        <w:t>self._</w:t>
-      </w:r>
-      <w:proofErr w:type="gramEnd"/>
-      <w:r>
-        <w:rPr>
-          <w:rFonts w:ascii="Courier New" w:hAnsi="Courier New" w:cs="Courier New"/>
-          <w:sz w:val="20"/>
-          <w:szCs w:val="20"/>
-        </w:rPr>
-        <w:t>dias = dias</w:t>
+        <w:t>            raise ErrorServicio("Días inválidos")</w:t>
+      </w:r>
+    </w:p>
+    <w:p>
+      <w:pPr>
+        <w:spacing w:line="480" w:lineRule="auto"/>
+        <w:rPr>
+          <w:rFonts w:ascii="Courier New" w:hAnsi="Courier New" w:cs="Courier New"/>
+          <w:sz w:val="20"/>
+          <w:szCs w:val="20"/>
+        </w:rPr>
+      </w:pPr>
+      <w:r>
+        <w:rPr>
+          <w:rFonts w:ascii="Courier New" w:hAnsi="Courier New" w:cs="Courier New"/>
+          <w:sz w:val="20"/>
+          <w:szCs w:val="20"/>
+        </w:rPr>
+        <w:t>        self._dias = dias</w:t>
       </w:r>
     </w:p>
     <w:p>
@@ -2673,27 +2208,7 @@
           <w:szCs w:val="20"/>
           <w:lang w:val="en-US"/>
         </w:rPr>
-        <w:t xml:space="preserve">return </w:t>
-      </w:r>
-      <w:proofErr w:type="gramStart"/>
-      <w:r>
-        <w:rPr>
-          <w:rFonts w:ascii="Courier New" w:hAnsi="Courier New" w:cs="Courier New"/>
-          <w:sz w:val="20"/>
-          <w:szCs w:val="20"/>
-          <w:lang w:val="en-US"/>
-        </w:rPr>
-        <w:t>self._</w:t>
-      </w:r>
-      <w:proofErr w:type="gramEnd"/>
-      <w:r>
-        <w:rPr>
-          <w:rFonts w:ascii="Courier New" w:hAnsi="Courier New" w:cs="Courier New"/>
-          <w:sz w:val="20"/>
-          <w:szCs w:val="20"/>
-          <w:lang w:val="en-US"/>
-        </w:rPr>
-        <w:t>dias * 30000</w:t>
+        <w:t>return self._dias * 30000</w:t>
       </w:r>
     </w:p>
     <w:p>
@@ -2740,97 +2255,43 @@
           <w:sz w:val="20"/>
           <w:szCs w:val="20"/>
         </w:rPr>
-        <w:t>return f"Alquiler de equipo por {</w:t>
-      </w:r>
-      <w:proofErr w:type="gramStart"/>
-      <w:r>
-        <w:rPr>
-          <w:rFonts w:ascii="Courier New" w:hAnsi="Courier New" w:cs="Courier New"/>
-          <w:sz w:val="20"/>
-          <w:szCs w:val="20"/>
-        </w:rPr>
-        <w:t>self._</w:t>
-      </w:r>
-      <w:proofErr w:type="gramEnd"/>
-      <w:r>
-        <w:rPr>
-          <w:rFonts w:ascii="Courier New" w:hAnsi="Courier New" w:cs="Courier New"/>
-          <w:sz w:val="20"/>
-          <w:szCs w:val="20"/>
-        </w:rPr>
-        <w:t>dias} días"</w:t>
-      </w:r>
-    </w:p>
-    <w:p>
-      <w:pPr>
-        <w:spacing w:line="480" w:lineRule="auto"/>
-        <w:rPr>
-          <w:rFonts w:ascii="Courier New" w:hAnsi="Courier New" w:cs="Courier New"/>
-          <w:sz w:val="20"/>
-          <w:szCs w:val="20"/>
-        </w:rPr>
-      </w:pPr>
-      <w:r>
-        <w:rPr>
-          <w:rFonts w:ascii="Courier New" w:hAnsi="Courier New" w:cs="Courier New"/>
-          <w:sz w:val="20"/>
-          <w:szCs w:val="20"/>
-        </w:rPr>
-        <w:t xml:space="preserve">class </w:t>
-      </w:r>
-      <w:proofErr w:type="gramStart"/>
-      <w:r>
-        <w:rPr>
-          <w:rFonts w:ascii="Courier New" w:hAnsi="Courier New" w:cs="Courier New"/>
-          <w:sz w:val="20"/>
-          <w:szCs w:val="20"/>
-        </w:rPr>
-        <w:t>Asesoria(</w:t>
-      </w:r>
-      <w:proofErr w:type="gramEnd"/>
-      <w:r>
-        <w:rPr>
-          <w:rFonts w:ascii="Courier New" w:hAnsi="Courier New" w:cs="Courier New"/>
-          <w:sz w:val="20"/>
-          <w:szCs w:val="20"/>
-        </w:rPr>
-        <w:t>Servicio):</w:t>
-      </w:r>
-    </w:p>
-    <w:p>
-      <w:pPr>
-        <w:spacing w:line="480" w:lineRule="auto"/>
-        <w:rPr>
-          <w:rFonts w:ascii="Courier New" w:hAnsi="Courier New" w:cs="Courier New"/>
-          <w:sz w:val="20"/>
-          <w:szCs w:val="20"/>
-        </w:rPr>
-      </w:pPr>
-      <w:r>
-        <w:rPr>
-          <w:rFonts w:ascii="Courier New" w:hAnsi="Courier New" w:cs="Courier New"/>
-          <w:sz w:val="20"/>
-          <w:szCs w:val="20"/>
-        </w:rPr>
-        <w:t>    def __init_</w:t>
-      </w:r>
-      <w:proofErr w:type="gramStart"/>
-      <w:r>
-        <w:rPr>
-          <w:rFonts w:ascii="Courier New" w:hAnsi="Courier New" w:cs="Courier New"/>
-          <w:sz w:val="20"/>
-          <w:szCs w:val="20"/>
-        </w:rPr>
-        <w:t>_(</w:t>
-      </w:r>
-      <w:proofErr w:type="gramEnd"/>
-      <w:r>
-        <w:rPr>
-          <w:rFonts w:ascii="Courier New" w:hAnsi="Courier New" w:cs="Courier New"/>
-          <w:sz w:val="20"/>
-          <w:szCs w:val="20"/>
-        </w:rPr>
-        <w:t>self, sesiones):</w:t>
+        <w:t>return f"Alquiler de equipo por {self._dias} días"</w:t>
+      </w:r>
+    </w:p>
+    <w:p>
+      <w:pPr>
+        <w:spacing w:line="480" w:lineRule="auto"/>
+        <w:rPr>
+          <w:rFonts w:ascii="Courier New" w:hAnsi="Courier New" w:cs="Courier New"/>
+          <w:sz w:val="20"/>
+          <w:szCs w:val="20"/>
+        </w:rPr>
+      </w:pPr>
+      <w:r>
+        <w:rPr>
+          <w:rFonts w:ascii="Courier New" w:hAnsi="Courier New" w:cs="Courier New"/>
+          <w:sz w:val="20"/>
+          <w:szCs w:val="20"/>
+        </w:rPr>
+        <w:t>class Asesoria(Servicio):</w:t>
+      </w:r>
+    </w:p>
+    <w:p>
+      <w:pPr>
+        <w:spacing w:line="480" w:lineRule="auto"/>
+        <w:rPr>
+          <w:rFonts w:ascii="Courier New" w:hAnsi="Courier New" w:cs="Courier New"/>
+          <w:sz w:val="20"/>
+          <w:szCs w:val="20"/>
+        </w:rPr>
+      </w:pPr>
+      <w:r>
+        <w:rPr>
+          <w:rFonts w:ascii="Courier New" w:hAnsi="Courier New" w:cs="Courier New"/>
+          <w:sz w:val="20"/>
+          <w:szCs w:val="20"/>
+        </w:rPr>
+        <w:t>    def __init__(self, sesiones):</w:t>
       </w:r>
     </w:p>
     <w:p>
@@ -2866,61 +2327,25 @@
           <w:sz w:val="20"/>
           <w:szCs w:val="20"/>
         </w:rPr>
-        <w:t xml:space="preserve">            raise </w:t>
-      </w:r>
-      <w:proofErr w:type="gramStart"/>
-      <w:r>
-        <w:rPr>
-          <w:rFonts w:ascii="Courier New" w:hAnsi="Courier New" w:cs="Courier New"/>
-          <w:sz w:val="20"/>
-          <w:szCs w:val="20"/>
-        </w:rPr>
-        <w:t>ErrorServicio(</w:t>
-      </w:r>
-      <w:proofErr w:type="gramEnd"/>
-      <w:r>
-        <w:rPr>
-          <w:rFonts w:ascii="Courier New" w:hAnsi="Courier New" w:cs="Courier New"/>
-          <w:sz w:val="20"/>
-          <w:szCs w:val="20"/>
-        </w:rPr>
-        <w:t>"Sesiones inválidas")</w:t>
-      </w:r>
-    </w:p>
-    <w:p>
-      <w:pPr>
-        <w:spacing w:line="480" w:lineRule="auto"/>
-        <w:rPr>
-          <w:rFonts w:ascii="Courier New" w:hAnsi="Courier New" w:cs="Courier New"/>
-          <w:sz w:val="20"/>
-          <w:szCs w:val="20"/>
-        </w:rPr>
-      </w:pPr>
-      <w:r>
-        <w:rPr>
-          <w:rFonts w:ascii="Courier New" w:hAnsi="Courier New" w:cs="Courier New"/>
-          <w:sz w:val="20"/>
-          <w:szCs w:val="20"/>
-        </w:rPr>
-        <w:t xml:space="preserve">        </w:t>
-      </w:r>
-      <w:proofErr w:type="gramStart"/>
-      <w:r>
-        <w:rPr>
-          <w:rFonts w:ascii="Courier New" w:hAnsi="Courier New" w:cs="Courier New"/>
-          <w:sz w:val="20"/>
-          <w:szCs w:val="20"/>
-        </w:rPr>
-        <w:t>self._</w:t>
-      </w:r>
-      <w:proofErr w:type="gramEnd"/>
-      <w:r>
-        <w:rPr>
-          <w:rFonts w:ascii="Courier New" w:hAnsi="Courier New" w:cs="Courier New"/>
-          <w:sz w:val="20"/>
-          <w:szCs w:val="20"/>
-        </w:rPr>
-        <w:t>sesiones = sesiones</w:t>
+        <w:t>            raise ErrorServicio("Sesiones inválidas")</w:t>
+      </w:r>
+    </w:p>
+    <w:p>
+      <w:pPr>
+        <w:spacing w:line="480" w:lineRule="auto"/>
+        <w:rPr>
+          <w:rFonts w:ascii="Courier New" w:hAnsi="Courier New" w:cs="Courier New"/>
+          <w:sz w:val="20"/>
+          <w:szCs w:val="20"/>
+        </w:rPr>
+      </w:pPr>
+      <w:r>
+        <w:rPr>
+          <w:rFonts w:ascii="Courier New" w:hAnsi="Courier New" w:cs="Courier New"/>
+          <w:sz w:val="20"/>
+          <w:szCs w:val="20"/>
+        </w:rPr>
+        <w:t>        self._sesiones = sesiones</w:t>
       </w:r>
     </w:p>
     <w:p>
@@ -2956,25 +2381,7 @@
           <w:sz w:val="20"/>
           <w:szCs w:val="20"/>
         </w:rPr>
-        <w:t xml:space="preserve">        return </w:t>
-      </w:r>
-      <w:proofErr w:type="gramStart"/>
-      <w:r>
-        <w:rPr>
-          <w:rFonts w:ascii="Courier New" w:hAnsi="Courier New" w:cs="Courier New"/>
-          <w:sz w:val="20"/>
-          <w:szCs w:val="20"/>
-        </w:rPr>
-        <w:t>self._</w:t>
-      </w:r>
-      <w:proofErr w:type="gramEnd"/>
-      <w:r>
-        <w:rPr>
-          <w:rFonts w:ascii="Courier New" w:hAnsi="Courier New" w:cs="Courier New"/>
-          <w:sz w:val="20"/>
-          <w:szCs w:val="20"/>
-        </w:rPr>
-        <w:t>sesiones * 80000</w:t>
+        <w:t>        return self._sesiones * 80000</w:t>
       </w:r>
     </w:p>
     <w:p>
@@ -3010,25 +2417,7 @@
           <w:sz w:val="20"/>
           <w:szCs w:val="20"/>
         </w:rPr>
-        <w:t>        return f"Asesoría por {</w:t>
-      </w:r>
-      <w:proofErr w:type="gramStart"/>
-      <w:r>
-        <w:rPr>
-          <w:rFonts w:ascii="Courier New" w:hAnsi="Courier New" w:cs="Courier New"/>
-          <w:sz w:val="20"/>
-          <w:szCs w:val="20"/>
-        </w:rPr>
-        <w:t>self._</w:t>
-      </w:r>
-      <w:proofErr w:type="gramEnd"/>
-      <w:r>
-        <w:rPr>
-          <w:rFonts w:ascii="Courier New" w:hAnsi="Courier New" w:cs="Courier New"/>
-          <w:sz w:val="20"/>
-          <w:szCs w:val="20"/>
-        </w:rPr>
-        <w:t>sesiones} sesiones"</w:t>
+        <w:t>        return f"Asesoría por {self._sesiones} sesiones"</w:t>
       </w:r>
     </w:p>
     <w:p>
@@ -3128,27 +2517,7 @@
           <w:szCs w:val="20"/>
           <w:lang w:val="en-US"/>
         </w:rPr>
-        <w:t>    def __init_</w:t>
-      </w:r>
-      <w:proofErr w:type="gramStart"/>
-      <w:r>
-        <w:rPr>
-          <w:rFonts w:ascii="Courier New" w:hAnsi="Courier New" w:cs="Courier New"/>
-          <w:sz w:val="20"/>
-          <w:szCs w:val="20"/>
-          <w:lang w:val="en-US"/>
-        </w:rPr>
-        <w:t>_(</w:t>
-      </w:r>
-      <w:proofErr w:type="gramEnd"/>
-      <w:r>
-        <w:rPr>
-          <w:rFonts w:ascii="Courier New" w:hAnsi="Courier New" w:cs="Courier New"/>
-          <w:sz w:val="20"/>
-          <w:szCs w:val="20"/>
-          <w:lang w:val="en-US"/>
-        </w:rPr>
-        <w:t>self, cliente, servicio):</w:t>
+        <w:t>    def __init__(self, cliente, servicio):</w:t>
       </w:r>
     </w:p>
     <w:p>
@@ -3195,25 +2564,7 @@
           <w:sz w:val="20"/>
           <w:szCs w:val="20"/>
         </w:rPr>
-        <w:t xml:space="preserve">raise </w:t>
-      </w:r>
-      <w:proofErr w:type="gramStart"/>
-      <w:r>
-        <w:rPr>
-          <w:rFonts w:ascii="Courier New" w:hAnsi="Courier New" w:cs="Courier New"/>
-          <w:sz w:val="20"/>
-          <w:szCs w:val="20"/>
-        </w:rPr>
-        <w:t>ErrorReserva(</w:t>
-      </w:r>
-      <w:proofErr w:type="gramEnd"/>
-      <w:r>
-        <w:rPr>
-          <w:rFonts w:ascii="Courier New" w:hAnsi="Courier New" w:cs="Courier New"/>
-          <w:sz w:val="20"/>
-          <w:szCs w:val="20"/>
-        </w:rPr>
-        <w:t>"Datos incompletos")</w:t>
+        <w:t>raise ErrorReserva("Datos incompletos")</w:t>
       </w:r>
     </w:p>
     <w:p>
@@ -3242,97 +2593,43 @@
           <w:szCs w:val="20"/>
         </w:rPr>
         <w:lastRenderedPageBreak/>
-        <w:t xml:space="preserve">        </w:t>
-      </w:r>
-      <w:proofErr w:type="gramStart"/>
-      <w:r>
-        <w:rPr>
-          <w:rFonts w:ascii="Courier New" w:hAnsi="Courier New" w:cs="Courier New"/>
-          <w:sz w:val="20"/>
-          <w:szCs w:val="20"/>
-        </w:rPr>
-        <w:t>self._</w:t>
-      </w:r>
-      <w:proofErr w:type="gramEnd"/>
-      <w:r>
-        <w:rPr>
-          <w:rFonts w:ascii="Courier New" w:hAnsi="Courier New" w:cs="Courier New"/>
-          <w:sz w:val="20"/>
-          <w:szCs w:val="20"/>
-        </w:rPr>
-        <w:t>cliente = cliente</w:t>
-      </w:r>
-    </w:p>
-    <w:p>
-      <w:pPr>
-        <w:spacing w:line="480" w:lineRule="auto"/>
-        <w:rPr>
-          <w:rFonts w:ascii="Courier New" w:hAnsi="Courier New" w:cs="Courier New"/>
-          <w:sz w:val="20"/>
-          <w:szCs w:val="20"/>
-        </w:rPr>
-      </w:pPr>
-      <w:r>
-        <w:rPr>
-          <w:rFonts w:ascii="Courier New" w:hAnsi="Courier New" w:cs="Courier New"/>
-          <w:sz w:val="20"/>
-          <w:szCs w:val="20"/>
-        </w:rPr>
-        <w:t xml:space="preserve">        </w:t>
-      </w:r>
-      <w:proofErr w:type="gramStart"/>
-      <w:r>
-        <w:rPr>
-          <w:rFonts w:ascii="Courier New" w:hAnsi="Courier New" w:cs="Courier New"/>
-          <w:sz w:val="20"/>
-          <w:szCs w:val="20"/>
-        </w:rPr>
-        <w:t>self._</w:t>
-      </w:r>
-      <w:proofErr w:type="gramEnd"/>
-      <w:r>
-        <w:rPr>
-          <w:rFonts w:ascii="Courier New" w:hAnsi="Courier New" w:cs="Courier New"/>
-          <w:sz w:val="20"/>
-          <w:szCs w:val="20"/>
-        </w:rPr>
-        <w:t>servicio = servicio</w:t>
-      </w:r>
-    </w:p>
-    <w:p>
-      <w:pPr>
-        <w:spacing w:line="480" w:lineRule="auto"/>
-        <w:rPr>
-          <w:rFonts w:ascii="Courier New" w:hAnsi="Courier New" w:cs="Courier New"/>
-          <w:sz w:val="20"/>
-          <w:szCs w:val="20"/>
-        </w:rPr>
-      </w:pPr>
-      <w:r>
-        <w:rPr>
-          <w:rFonts w:ascii="Courier New" w:hAnsi="Courier New" w:cs="Courier New"/>
-          <w:sz w:val="20"/>
-          <w:szCs w:val="20"/>
-        </w:rPr>
-        <w:t xml:space="preserve">        </w:t>
-      </w:r>
-      <w:proofErr w:type="gramStart"/>
-      <w:r>
-        <w:rPr>
-          <w:rFonts w:ascii="Courier New" w:hAnsi="Courier New" w:cs="Courier New"/>
-          <w:sz w:val="20"/>
-          <w:szCs w:val="20"/>
-        </w:rPr>
-        <w:t>self._</w:t>
-      </w:r>
-      <w:proofErr w:type="gramEnd"/>
-      <w:r>
-        <w:rPr>
-          <w:rFonts w:ascii="Courier New" w:hAnsi="Courier New" w:cs="Courier New"/>
-          <w:sz w:val="20"/>
-          <w:szCs w:val="20"/>
-        </w:rPr>
-        <w:t>estado = "Pendiente"</w:t>
+        <w:t>        self._cliente = cliente</w:t>
+      </w:r>
+    </w:p>
+    <w:p>
+      <w:pPr>
+        <w:spacing w:line="480" w:lineRule="auto"/>
+        <w:rPr>
+          <w:rFonts w:ascii="Courier New" w:hAnsi="Courier New" w:cs="Courier New"/>
+          <w:sz w:val="20"/>
+          <w:szCs w:val="20"/>
+        </w:rPr>
+      </w:pPr>
+      <w:r>
+        <w:rPr>
+          <w:rFonts w:ascii="Courier New" w:hAnsi="Courier New" w:cs="Courier New"/>
+          <w:sz w:val="20"/>
+          <w:szCs w:val="20"/>
+        </w:rPr>
+        <w:t>        self._servicio = servicio</w:t>
+      </w:r>
+    </w:p>
+    <w:p>
+      <w:pPr>
+        <w:spacing w:line="480" w:lineRule="auto"/>
+        <w:rPr>
+          <w:rFonts w:ascii="Courier New" w:hAnsi="Courier New" w:cs="Courier New"/>
+          <w:sz w:val="20"/>
+          <w:szCs w:val="20"/>
+        </w:rPr>
+      </w:pPr>
+      <w:r>
+        <w:rPr>
+          <w:rFonts w:ascii="Courier New" w:hAnsi="Courier New" w:cs="Courier New"/>
+          <w:sz w:val="20"/>
+          <w:szCs w:val="20"/>
+        </w:rPr>
+        <w:t>        self._estado = "Pendiente"</w:t>
       </w:r>
     </w:p>
     <w:p>
@@ -3368,25 +2665,7 @@
           <w:sz w:val="20"/>
           <w:szCs w:val="20"/>
         </w:rPr>
-        <w:t xml:space="preserve">        </w:t>
-      </w:r>
-      <w:proofErr w:type="gramStart"/>
-      <w:r>
-        <w:rPr>
-          <w:rFonts w:ascii="Courier New" w:hAnsi="Courier New" w:cs="Courier New"/>
-          <w:sz w:val="20"/>
-          <w:szCs w:val="20"/>
-        </w:rPr>
-        <w:t>self._</w:t>
-      </w:r>
-      <w:proofErr w:type="gramEnd"/>
-      <w:r>
-        <w:rPr>
-          <w:rFonts w:ascii="Courier New" w:hAnsi="Courier New" w:cs="Courier New"/>
-          <w:sz w:val="20"/>
-          <w:szCs w:val="20"/>
-        </w:rPr>
-        <w:t>estado = "Confirmada"</w:t>
+        <w:t>        self._estado = "Confirmada"</w:t>
       </w:r>
     </w:p>
     <w:p>
@@ -3422,25 +2701,7 @@
           <w:sz w:val="20"/>
           <w:szCs w:val="20"/>
         </w:rPr>
-        <w:t xml:space="preserve">        </w:t>
-      </w:r>
-      <w:proofErr w:type="gramStart"/>
-      <w:r>
-        <w:rPr>
-          <w:rFonts w:ascii="Courier New" w:hAnsi="Courier New" w:cs="Courier New"/>
-          <w:sz w:val="20"/>
-          <w:szCs w:val="20"/>
-        </w:rPr>
-        <w:t>self._</w:t>
-      </w:r>
-      <w:proofErr w:type="gramEnd"/>
-      <w:r>
-        <w:rPr>
-          <w:rFonts w:ascii="Courier New" w:hAnsi="Courier New" w:cs="Courier New"/>
-          <w:sz w:val="20"/>
-          <w:szCs w:val="20"/>
-        </w:rPr>
-        <w:t>estado = "Cancelada"</w:t>
+        <w:t>        self._estado = "Cancelada"</w:t>
       </w:r>
     </w:p>
     <w:p>
@@ -3476,61 +2737,7 @@
           <w:sz w:val="20"/>
           <w:szCs w:val="20"/>
         </w:rPr>
-        <w:t>        return f"{</w:t>
-      </w:r>
-      <w:proofErr w:type="gramStart"/>
-      <w:r>
-        <w:rPr>
-          <w:rFonts w:ascii="Courier New" w:hAnsi="Courier New" w:cs="Courier New"/>
-          <w:sz w:val="20"/>
-          <w:szCs w:val="20"/>
-        </w:rPr>
-        <w:t>self._cliente.mostrar</w:t>
-      </w:r>
-      <w:proofErr w:type="gramEnd"/>
-      <w:r>
-        <w:rPr>
-          <w:rFonts w:ascii="Courier New" w:hAnsi="Courier New" w:cs="Courier New"/>
-          <w:sz w:val="20"/>
-          <w:szCs w:val="20"/>
-        </w:rPr>
-        <w:t>()} | {</w:t>
-      </w:r>
-      <w:proofErr w:type="gramStart"/>
-      <w:r>
-        <w:rPr>
-          <w:rFonts w:ascii="Courier New" w:hAnsi="Courier New" w:cs="Courier New"/>
-          <w:sz w:val="20"/>
-          <w:szCs w:val="20"/>
-        </w:rPr>
-        <w:t>self._servicio.descripcion</w:t>
-      </w:r>
-      <w:proofErr w:type="gramEnd"/>
-      <w:r>
-        <w:rPr>
-          <w:rFonts w:ascii="Courier New" w:hAnsi="Courier New" w:cs="Courier New"/>
-          <w:sz w:val="20"/>
-          <w:szCs w:val="20"/>
-        </w:rPr>
-        <w:t>()} | Estado: {</w:t>
-      </w:r>
-      <w:proofErr w:type="gramStart"/>
-      <w:r>
-        <w:rPr>
-          <w:rFonts w:ascii="Courier New" w:hAnsi="Courier New" w:cs="Courier New"/>
-          <w:sz w:val="20"/>
-          <w:szCs w:val="20"/>
-        </w:rPr>
-        <w:t>self._</w:t>
-      </w:r>
-      <w:proofErr w:type="gramEnd"/>
-      <w:r>
-        <w:rPr>
-          <w:rFonts w:ascii="Courier New" w:hAnsi="Courier New" w:cs="Courier New"/>
-          <w:sz w:val="20"/>
-          <w:szCs w:val="20"/>
-        </w:rPr>
-        <w:t>estado}"</w:t>
+        <w:t>        return f"{self._cliente.mostrar()} | {self._servicio.descripcion()} | Estado: {self._estado}"</w:t>
       </w:r>
     </w:p>
     <w:p>
@@ -3632,23 +2839,13 @@
           <w:szCs w:val="20"/>
         </w:rPr>
       </w:pPr>
-      <w:proofErr w:type="gramStart"/>
-      <w:r>
-        <w:rPr>
-          <w:rFonts w:ascii="Courier New" w:hAnsi="Courier New" w:cs="Courier New"/>
-          <w:sz w:val="20"/>
-          <w:szCs w:val="20"/>
-        </w:rPr>
-        <w:t>print(</w:t>
-      </w:r>
-      <w:proofErr w:type="gramEnd"/>
-      <w:r>
-        <w:rPr>
-          <w:rFonts w:ascii="Courier New" w:hAnsi="Courier New" w:cs="Courier New"/>
-          <w:sz w:val="20"/>
-          <w:szCs w:val="20"/>
-        </w:rPr>
-        <w:t>"\n--- INICIO DEL SISTEMA ---\n")</w:t>
+      <w:r>
+        <w:rPr>
+          <w:rFonts w:ascii="Courier New" w:hAnsi="Courier New" w:cs="Courier New"/>
+          <w:sz w:val="20"/>
+          <w:szCs w:val="20"/>
+        </w:rPr>
+        <w:t>print("\n--- INICIO DEL SISTEMA ---\n")</w:t>
       </w:r>
     </w:p>
     <w:p>
@@ -3702,25 +2899,278 @@
           <w:sz w:val="20"/>
           <w:szCs w:val="20"/>
         </w:rPr>
-        <w:t xml:space="preserve">    c1 = </w:t>
-      </w:r>
-      <w:proofErr w:type="gramStart"/>
-      <w:r>
-        <w:rPr>
-          <w:rFonts w:ascii="Courier New" w:hAnsi="Courier New" w:cs="Courier New"/>
-          <w:sz w:val="20"/>
-          <w:szCs w:val="20"/>
-        </w:rPr>
-        <w:t>Cliente(</w:t>
-      </w:r>
-      <w:proofErr w:type="gramEnd"/>
-      <w:r>
-        <w:rPr>
-          <w:rFonts w:ascii="Courier New" w:hAnsi="Courier New" w:cs="Courier New"/>
-          <w:sz w:val="20"/>
-          <w:szCs w:val="20"/>
-        </w:rPr>
-        <w:t>"Jose", "jose@gmail.com")</w:t>
+        <w:t>    c1 = Cliente("Jose", "jose@gmail.com")</w:t>
+      </w:r>
+    </w:p>
+    <w:p>
+      <w:pPr>
+        <w:spacing w:line="480" w:lineRule="auto"/>
+        <w:rPr>
+          <w:rFonts w:ascii="Courier New" w:hAnsi="Courier New" w:cs="Courier New"/>
+          <w:sz w:val="20"/>
+          <w:szCs w:val="20"/>
+        </w:rPr>
+      </w:pPr>
+      <w:r>
+        <w:rPr>
+          <w:rFonts w:ascii="Courier New" w:hAnsi="Courier New" w:cs="Courier New"/>
+          <w:sz w:val="20"/>
+          <w:szCs w:val="20"/>
+        </w:rPr>
+        <w:t>    clientes.append(c1)</w:t>
+      </w:r>
+    </w:p>
+    <w:p>
+      <w:pPr>
+        <w:spacing w:line="480" w:lineRule="auto"/>
+        <w:rPr>
+          <w:rFonts w:ascii="Courier New" w:hAnsi="Courier New" w:cs="Courier New"/>
+          <w:sz w:val="20"/>
+          <w:szCs w:val="20"/>
+        </w:rPr>
+      </w:pPr>
+      <w:r>
+        <w:rPr>
+          <w:rFonts w:ascii="Courier New" w:hAnsi="Courier New" w:cs="Courier New"/>
+          <w:sz w:val="20"/>
+          <w:szCs w:val="20"/>
+        </w:rPr>
+        <w:t>    c2 = Cliente("Maria", "maria@gmail.com")</w:t>
+      </w:r>
+    </w:p>
+    <w:p>
+      <w:pPr>
+        <w:spacing w:line="480" w:lineRule="auto"/>
+        <w:rPr>
+          <w:rFonts w:ascii="Courier New" w:hAnsi="Courier New" w:cs="Courier New"/>
+          <w:sz w:val="20"/>
+          <w:szCs w:val="20"/>
+        </w:rPr>
+      </w:pPr>
+      <w:r>
+        <w:rPr>
+          <w:rFonts w:ascii="Courier New" w:hAnsi="Courier New" w:cs="Courier New"/>
+          <w:sz w:val="20"/>
+          <w:szCs w:val="20"/>
+        </w:rPr>
+        <w:t>    clientes.append(c2)</w:t>
+      </w:r>
+    </w:p>
+    <w:p>
+      <w:pPr>
+        <w:spacing w:line="480" w:lineRule="auto"/>
+        <w:rPr>
+          <w:rFonts w:ascii="Courier New" w:hAnsi="Courier New" w:cs="Courier New"/>
+          <w:sz w:val="20"/>
+          <w:szCs w:val="20"/>
+        </w:rPr>
+      </w:pPr>
+      <w:r>
+        <w:rPr>
+          <w:rFonts w:ascii="Courier New" w:hAnsi="Courier New" w:cs="Courier New"/>
+          <w:sz w:val="20"/>
+          <w:szCs w:val="20"/>
+        </w:rPr>
+        <w:lastRenderedPageBreak/>
+        <w:t>    c3 = Cliente("Luis", "luis@gmail.com")</w:t>
+      </w:r>
+    </w:p>
+    <w:p>
+      <w:pPr>
+        <w:spacing w:line="480" w:lineRule="auto"/>
+        <w:rPr>
+          <w:rFonts w:ascii="Courier New" w:hAnsi="Courier New" w:cs="Courier New"/>
+          <w:sz w:val="20"/>
+          <w:szCs w:val="20"/>
+        </w:rPr>
+      </w:pPr>
+      <w:r>
+        <w:rPr>
+          <w:rFonts w:ascii="Courier New" w:hAnsi="Courier New" w:cs="Courier New"/>
+          <w:sz w:val="20"/>
+          <w:szCs w:val="20"/>
+        </w:rPr>
+        <w:t>    clientes.append(c3)</w:t>
+      </w:r>
+    </w:p>
+    <w:p>
+      <w:pPr>
+        <w:spacing w:line="480" w:lineRule="auto"/>
+        <w:rPr>
+          <w:rFonts w:ascii="Courier New" w:hAnsi="Courier New" w:cs="Courier New"/>
+          <w:sz w:val="20"/>
+          <w:szCs w:val="20"/>
+        </w:rPr>
+      </w:pPr>
+      <w:r>
+        <w:rPr>
+          <w:rFonts w:ascii="Courier New" w:hAnsi="Courier New" w:cs="Courier New"/>
+          <w:sz w:val="20"/>
+          <w:szCs w:val="20"/>
+        </w:rPr>
+        <w:t>    c4 = Cliente("Ana", "correo_invalido")  # ERROR</w:t>
+      </w:r>
+    </w:p>
+    <w:p>
+      <w:pPr>
+        <w:spacing w:line="480" w:lineRule="auto"/>
+        <w:rPr>
+          <w:rFonts w:ascii="Courier New" w:hAnsi="Courier New" w:cs="Courier New"/>
+          <w:sz w:val="20"/>
+          <w:szCs w:val="20"/>
+        </w:rPr>
+      </w:pPr>
+      <w:r>
+        <w:rPr>
+          <w:rFonts w:ascii="Courier New" w:hAnsi="Courier New" w:cs="Courier New"/>
+          <w:sz w:val="20"/>
+          <w:szCs w:val="20"/>
+        </w:rPr>
+        <w:t>    clientes.append(c4)</w:t>
+      </w:r>
+    </w:p>
+    <w:p>
+      <w:pPr>
+        <w:spacing w:line="480" w:lineRule="auto"/>
+        <w:rPr>
+          <w:rFonts w:ascii="Courier New" w:hAnsi="Courier New" w:cs="Courier New"/>
+          <w:sz w:val="20"/>
+          <w:szCs w:val="20"/>
+        </w:rPr>
+      </w:pPr>
+      <w:r>
+        <w:rPr>
+          <w:rFonts w:ascii="Courier New" w:hAnsi="Courier New" w:cs="Courier New"/>
+          <w:sz w:val="20"/>
+          <w:szCs w:val="20"/>
+        </w:rPr>
+        <w:t>except ErrorCliente as e:</w:t>
+      </w:r>
+    </w:p>
+    <w:p>
+      <w:pPr>
+        <w:spacing w:line="480" w:lineRule="auto"/>
+        <w:rPr>
+          <w:rFonts w:ascii="Courier New" w:hAnsi="Courier New" w:cs="Courier New"/>
+          <w:sz w:val="20"/>
+          <w:szCs w:val="20"/>
+        </w:rPr>
+      </w:pPr>
+      <w:r>
+        <w:rPr>
+          <w:rFonts w:ascii="Courier New" w:hAnsi="Courier New" w:cs="Courier New"/>
+          <w:sz w:val="20"/>
+          <w:szCs w:val="20"/>
+        </w:rPr>
+        <w:t>    print("Error cliente:", e)</w:t>
+      </w:r>
+    </w:p>
+    <w:p>
+      <w:pPr>
+        <w:spacing w:line="480" w:lineRule="auto"/>
+        <w:rPr>
+          <w:rFonts w:ascii="Courier New" w:hAnsi="Courier New" w:cs="Courier New"/>
+          <w:sz w:val="20"/>
+          <w:szCs w:val="20"/>
+        </w:rPr>
+      </w:pPr>
+      <w:r>
+        <w:rPr>
+          <w:rFonts w:ascii="Courier New" w:hAnsi="Courier New" w:cs="Courier New"/>
+          <w:sz w:val="20"/>
+          <w:szCs w:val="20"/>
+        </w:rPr>
+        <w:t>    guardar_error("Error cliente: " + str(e))</w:t>
+      </w:r>
+    </w:p>
+    <w:p>
+      <w:pPr>
+        <w:spacing w:line="480" w:lineRule="auto"/>
+        <w:rPr>
+          <w:rFonts w:ascii="Courier New" w:hAnsi="Courier New" w:cs="Courier New"/>
+          <w:sz w:val="20"/>
+          <w:szCs w:val="20"/>
+        </w:rPr>
+      </w:pPr>
+      <w:r>
+        <w:rPr>
+          <w:rFonts w:ascii="Courier New" w:hAnsi="Courier New" w:cs="Courier New"/>
+          <w:sz w:val="20"/>
+          <w:szCs w:val="20"/>
+        </w:rPr>
+        <w:t>finally:</w:t>
+      </w:r>
+    </w:p>
+    <w:p>
+      <w:pPr>
+        <w:spacing w:line="480" w:lineRule="auto"/>
+        <w:rPr>
+          <w:rFonts w:ascii="Courier New" w:hAnsi="Courier New" w:cs="Courier New"/>
+          <w:sz w:val="20"/>
+          <w:szCs w:val="20"/>
+        </w:rPr>
+      </w:pPr>
+      <w:r>
+        <w:rPr>
+          <w:rFonts w:ascii="Courier New" w:hAnsi="Courier New" w:cs="Courier New"/>
+          <w:sz w:val="20"/>
+          <w:szCs w:val="20"/>
+        </w:rPr>
+        <w:t>    print("Proceso de clientes finalizado\n")</w:t>
+      </w:r>
+    </w:p>
+    <w:p>
+      <w:pPr>
+        <w:spacing w:line="480" w:lineRule="auto"/>
+        <w:rPr>
+          <w:rFonts w:ascii="Courier New" w:hAnsi="Courier New" w:cs="Courier New"/>
+          <w:sz w:val="20"/>
+          <w:szCs w:val="20"/>
+        </w:rPr>
+      </w:pPr>
+      <w:r>
+        <w:rPr>
+          <w:rFonts w:ascii="Courier New" w:hAnsi="Courier New" w:cs="Courier New"/>
+          <w:sz w:val="20"/>
+          <w:szCs w:val="20"/>
+        </w:rPr>
+        <w:t># ----------- SERVICIOS Y RESERVAS -----------</w:t>
+      </w:r>
+    </w:p>
+    <w:p>
+      <w:pPr>
+        <w:spacing w:line="480" w:lineRule="auto"/>
+        <w:rPr>
+          <w:rFonts w:ascii="Courier New" w:hAnsi="Courier New" w:cs="Courier New"/>
+          <w:sz w:val="20"/>
+          <w:szCs w:val="20"/>
+        </w:rPr>
+      </w:pPr>
+      <w:r>
+        <w:rPr>
+          <w:rFonts w:ascii="Courier New" w:hAnsi="Courier New" w:cs="Courier New"/>
+          <w:sz w:val="20"/>
+          <w:szCs w:val="20"/>
+        </w:rPr>
+        <w:t>try:</w:t>
+      </w:r>
+    </w:p>
+    <w:p>
+      <w:pPr>
+        <w:spacing w:line="480" w:lineRule="auto"/>
+        <w:rPr>
+          <w:rFonts w:ascii="Courier New" w:hAnsi="Courier New" w:cs="Courier New"/>
+          <w:sz w:val="20"/>
+          <w:szCs w:val="20"/>
+        </w:rPr>
+      </w:pPr>
+      <w:r>
+        <w:rPr>
+          <w:rFonts w:ascii="Courier New" w:hAnsi="Courier New" w:cs="Courier New"/>
+          <w:sz w:val="20"/>
+          <w:szCs w:val="20"/>
+        </w:rPr>
+        <w:t>    s1 = ReservaSala(2)</w:t>
       </w:r>
     </w:p>
     <w:p>
@@ -3740,59 +3190,49 @@
         </w:rPr>
         <w:t xml:space="preserve">    </w:t>
       </w:r>
-      <w:proofErr w:type="gramStart"/>
-      <w:r>
-        <w:rPr>
-          <w:rFonts w:ascii="Courier New" w:hAnsi="Courier New" w:cs="Courier New"/>
-          <w:sz w:val="20"/>
-          <w:szCs w:val="20"/>
-        </w:rPr>
-        <w:t>clientes.append</w:t>
-      </w:r>
-      <w:proofErr w:type="gramEnd"/>
-      <w:r>
-        <w:rPr>
-          <w:rFonts w:ascii="Courier New" w:hAnsi="Courier New" w:cs="Courier New"/>
-          <w:sz w:val="20"/>
-          <w:szCs w:val="20"/>
-        </w:rPr>
-        <w:t>(c1)</w:t>
-      </w:r>
-    </w:p>
-    <w:p>
-      <w:pPr>
-        <w:spacing w:line="480" w:lineRule="auto"/>
-        <w:rPr>
-          <w:rFonts w:ascii="Courier New" w:hAnsi="Courier New" w:cs="Courier New"/>
-          <w:sz w:val="20"/>
-          <w:szCs w:val="20"/>
-        </w:rPr>
-      </w:pPr>
-      <w:r>
-        <w:rPr>
-          <w:rFonts w:ascii="Courier New" w:hAnsi="Courier New" w:cs="Courier New"/>
-          <w:sz w:val="20"/>
-          <w:szCs w:val="20"/>
-        </w:rPr>
-        <w:t xml:space="preserve">    c2 = </w:t>
-      </w:r>
-      <w:proofErr w:type="gramStart"/>
-      <w:r>
-        <w:rPr>
-          <w:rFonts w:ascii="Courier New" w:hAnsi="Courier New" w:cs="Courier New"/>
-          <w:sz w:val="20"/>
-          <w:szCs w:val="20"/>
-        </w:rPr>
-        <w:t>Cliente(</w:t>
-      </w:r>
-      <w:proofErr w:type="gramEnd"/>
-      <w:r>
-        <w:rPr>
-          <w:rFonts w:ascii="Courier New" w:hAnsi="Courier New" w:cs="Courier New"/>
-          <w:sz w:val="20"/>
-          <w:szCs w:val="20"/>
-        </w:rPr>
-        <w:t>"Maria", "maria@gmail.com")</w:t>
+      <w:r>
+        <w:rPr>
+          <w:rFonts w:ascii="Courier New" w:hAnsi="Courier New" w:cs="Courier New"/>
+          <w:sz w:val="20"/>
+          <w:szCs w:val="20"/>
+        </w:rPr>
+        <w:t>r1 = Reserva(c1, s1)</w:t>
+      </w:r>
+    </w:p>
+    <w:p>
+      <w:pPr>
+        <w:spacing w:line="480" w:lineRule="auto"/>
+        <w:rPr>
+          <w:rFonts w:ascii="Courier New" w:hAnsi="Courier New" w:cs="Courier New"/>
+          <w:sz w:val="20"/>
+          <w:szCs w:val="20"/>
+        </w:rPr>
+      </w:pPr>
+      <w:r>
+        <w:rPr>
+          <w:rFonts w:ascii="Courier New" w:hAnsi="Courier New" w:cs="Courier New"/>
+          <w:sz w:val="20"/>
+          <w:szCs w:val="20"/>
+        </w:rPr>
+        <w:t>    r1.confirmar()</w:t>
+      </w:r>
+    </w:p>
+    <w:p>
+      <w:pPr>
+        <w:spacing w:line="480" w:lineRule="auto"/>
+        <w:rPr>
+          <w:rFonts w:ascii="Courier New" w:hAnsi="Courier New" w:cs="Courier New"/>
+          <w:sz w:val="20"/>
+          <w:szCs w:val="20"/>
+        </w:rPr>
+      </w:pPr>
+      <w:r>
+        <w:rPr>
+          <w:rFonts w:ascii="Courier New" w:hAnsi="Courier New" w:cs="Courier New"/>
+          <w:sz w:val="20"/>
+          <w:szCs w:val="20"/>
+        </w:rPr>
+        <w:t>    reservas.append(r1)</w:t>
       </w:r>
     </w:p>
     <w:p>
@@ -3812,60 +3252,31 @@
         </w:rPr>
         <w:t xml:space="preserve">    </w:t>
       </w:r>
-      <w:proofErr w:type="gramStart"/>
-      <w:r>
-        <w:rPr>
-          <w:rFonts w:ascii="Courier New" w:hAnsi="Courier New" w:cs="Courier New"/>
-          <w:sz w:val="20"/>
-          <w:szCs w:val="20"/>
-        </w:rPr>
-        <w:t>clientes.append</w:t>
-      </w:r>
-      <w:proofErr w:type="gramEnd"/>
-      <w:r>
-        <w:rPr>
-          <w:rFonts w:ascii="Courier New" w:hAnsi="Courier New" w:cs="Courier New"/>
-          <w:sz w:val="20"/>
-          <w:szCs w:val="20"/>
-        </w:rPr>
-        <w:t>(c2)</w:t>
-      </w:r>
-    </w:p>
-    <w:p>
-      <w:pPr>
-        <w:spacing w:line="480" w:lineRule="auto"/>
-        <w:rPr>
-          <w:rFonts w:ascii="Courier New" w:hAnsi="Courier New" w:cs="Courier New"/>
-          <w:sz w:val="20"/>
-          <w:szCs w:val="20"/>
-        </w:rPr>
-      </w:pPr>
-      <w:r>
-        <w:rPr>
-          <w:rFonts w:ascii="Courier New" w:hAnsi="Courier New" w:cs="Courier New"/>
-          <w:sz w:val="20"/>
-          <w:szCs w:val="20"/>
-        </w:rPr>
-        <w:lastRenderedPageBreak/>
-        <w:t xml:space="preserve">    c3 = </w:t>
-      </w:r>
-      <w:proofErr w:type="gramStart"/>
-      <w:r>
-        <w:rPr>
-          <w:rFonts w:ascii="Courier New" w:hAnsi="Courier New" w:cs="Courier New"/>
-          <w:sz w:val="20"/>
-          <w:szCs w:val="20"/>
-        </w:rPr>
-        <w:t>Cliente(</w:t>
-      </w:r>
-      <w:proofErr w:type="gramEnd"/>
-      <w:r>
-        <w:rPr>
-          <w:rFonts w:ascii="Courier New" w:hAnsi="Courier New" w:cs="Courier New"/>
-          <w:sz w:val="20"/>
-          <w:szCs w:val="20"/>
-        </w:rPr>
-        <w:t>"Luis", "luis@gmail.com")</w:t>
+      <w:r>
+        <w:rPr>
+          <w:rFonts w:ascii="Courier New" w:hAnsi="Courier New" w:cs="Courier New"/>
+          <w:sz w:val="20"/>
+          <w:szCs w:val="20"/>
+        </w:rPr>
+        <w:t>s2 = AlquilerEquipo(3)</w:t>
+      </w:r>
+    </w:p>
+    <w:p>
+      <w:pPr>
+        <w:spacing w:line="480" w:lineRule="auto"/>
+        <w:rPr>
+          <w:rFonts w:ascii="Courier New" w:hAnsi="Courier New" w:cs="Courier New"/>
+          <w:sz w:val="20"/>
+          <w:szCs w:val="20"/>
+        </w:rPr>
+      </w:pPr>
+      <w:r>
+        <w:rPr>
+          <w:rFonts w:ascii="Courier New" w:hAnsi="Courier New" w:cs="Courier New"/>
+          <w:sz w:val="20"/>
+          <w:szCs w:val="20"/>
+        </w:rPr>
+        <w:t>    r2 = Reserva(c2, s2)</w:t>
       </w:r>
     </w:p>
     <w:p>
@@ -3885,669 +3296,67 @@
         </w:rPr>
         <w:t xml:space="preserve">    </w:t>
       </w:r>
-      <w:proofErr w:type="gramStart"/>
-      <w:r>
-        <w:rPr>
-          <w:rFonts w:ascii="Courier New" w:hAnsi="Courier New" w:cs="Courier New"/>
-          <w:sz w:val="20"/>
-          <w:szCs w:val="20"/>
-        </w:rPr>
-        <w:t>clientes.append</w:t>
-      </w:r>
-      <w:proofErr w:type="gramEnd"/>
-      <w:r>
-        <w:rPr>
-          <w:rFonts w:ascii="Courier New" w:hAnsi="Courier New" w:cs="Courier New"/>
-          <w:sz w:val="20"/>
-          <w:szCs w:val="20"/>
-        </w:rPr>
-        <w:t>(c3)</w:t>
-      </w:r>
-    </w:p>
-    <w:p>
-      <w:pPr>
-        <w:spacing w:line="480" w:lineRule="auto"/>
-        <w:rPr>
-          <w:rFonts w:ascii="Courier New" w:hAnsi="Courier New" w:cs="Courier New"/>
-          <w:sz w:val="20"/>
-          <w:szCs w:val="20"/>
-        </w:rPr>
-      </w:pPr>
-      <w:r>
-        <w:rPr>
-          <w:rFonts w:ascii="Courier New" w:hAnsi="Courier New" w:cs="Courier New"/>
-          <w:sz w:val="20"/>
-          <w:szCs w:val="20"/>
-        </w:rPr>
-        <w:t xml:space="preserve">    c4 = </w:t>
-      </w:r>
-      <w:proofErr w:type="gramStart"/>
-      <w:r>
-        <w:rPr>
-          <w:rFonts w:ascii="Courier New" w:hAnsi="Courier New" w:cs="Courier New"/>
-          <w:sz w:val="20"/>
-          <w:szCs w:val="20"/>
-        </w:rPr>
-        <w:t>Cliente(</w:t>
-      </w:r>
-      <w:proofErr w:type="gramEnd"/>
-      <w:r>
-        <w:rPr>
-          <w:rFonts w:ascii="Courier New" w:hAnsi="Courier New" w:cs="Courier New"/>
-          <w:sz w:val="20"/>
-          <w:szCs w:val="20"/>
-        </w:rPr>
-        <w:t>"Ana", "correo_invalido</w:t>
-      </w:r>
-      <w:proofErr w:type="gramStart"/>
-      <w:r>
-        <w:rPr>
-          <w:rFonts w:ascii="Courier New" w:hAnsi="Courier New" w:cs="Courier New"/>
-          <w:sz w:val="20"/>
-          <w:szCs w:val="20"/>
-        </w:rPr>
-        <w:t>")  #</w:t>
-      </w:r>
-      <w:proofErr w:type="gramEnd"/>
-      <w:r>
-        <w:rPr>
-          <w:rFonts w:ascii="Courier New" w:hAnsi="Courier New" w:cs="Courier New"/>
-          <w:sz w:val="20"/>
-          <w:szCs w:val="20"/>
-        </w:rPr>
-        <w:t xml:space="preserve"> ERROR</w:t>
-      </w:r>
-    </w:p>
-    <w:p>
-      <w:pPr>
-        <w:spacing w:line="480" w:lineRule="auto"/>
-        <w:rPr>
-          <w:rFonts w:ascii="Courier New" w:hAnsi="Courier New" w:cs="Courier New"/>
-          <w:sz w:val="20"/>
-          <w:szCs w:val="20"/>
-        </w:rPr>
-      </w:pPr>
-      <w:r>
-        <w:rPr>
-          <w:rFonts w:ascii="Courier New" w:hAnsi="Courier New" w:cs="Courier New"/>
-          <w:sz w:val="20"/>
-          <w:szCs w:val="20"/>
-        </w:rPr>
-        <w:t xml:space="preserve">    </w:t>
-      </w:r>
-      <w:proofErr w:type="gramStart"/>
-      <w:r>
-        <w:rPr>
-          <w:rFonts w:ascii="Courier New" w:hAnsi="Courier New" w:cs="Courier New"/>
-          <w:sz w:val="20"/>
-          <w:szCs w:val="20"/>
-        </w:rPr>
-        <w:t>clientes.append</w:t>
-      </w:r>
-      <w:proofErr w:type="gramEnd"/>
-      <w:r>
-        <w:rPr>
-          <w:rFonts w:ascii="Courier New" w:hAnsi="Courier New" w:cs="Courier New"/>
-          <w:sz w:val="20"/>
-          <w:szCs w:val="20"/>
-        </w:rPr>
-        <w:t>(c4)</w:t>
-      </w:r>
-    </w:p>
-    <w:p>
-      <w:pPr>
-        <w:spacing w:line="480" w:lineRule="auto"/>
-        <w:rPr>
-          <w:rFonts w:ascii="Courier New" w:hAnsi="Courier New" w:cs="Courier New"/>
-          <w:sz w:val="20"/>
-          <w:szCs w:val="20"/>
-        </w:rPr>
-      </w:pPr>
-      <w:r>
-        <w:rPr>
-          <w:rFonts w:ascii="Courier New" w:hAnsi="Courier New" w:cs="Courier New"/>
-          <w:sz w:val="20"/>
-          <w:szCs w:val="20"/>
-        </w:rPr>
-        <w:t>except ErrorCliente as e:</w:t>
-      </w:r>
-    </w:p>
-    <w:p>
-      <w:pPr>
-        <w:spacing w:line="480" w:lineRule="auto"/>
-        <w:rPr>
-          <w:rFonts w:ascii="Courier New" w:hAnsi="Courier New" w:cs="Courier New"/>
-          <w:sz w:val="20"/>
-          <w:szCs w:val="20"/>
-        </w:rPr>
-      </w:pPr>
-      <w:r>
-        <w:rPr>
-          <w:rFonts w:ascii="Courier New" w:hAnsi="Courier New" w:cs="Courier New"/>
-          <w:sz w:val="20"/>
-          <w:szCs w:val="20"/>
-        </w:rPr>
-        <w:t xml:space="preserve">    </w:t>
-      </w:r>
-      <w:proofErr w:type="gramStart"/>
-      <w:r>
-        <w:rPr>
-          <w:rFonts w:ascii="Courier New" w:hAnsi="Courier New" w:cs="Courier New"/>
-          <w:sz w:val="20"/>
-          <w:szCs w:val="20"/>
-        </w:rPr>
-        <w:t>print(</w:t>
-      </w:r>
-      <w:proofErr w:type="gramEnd"/>
-      <w:r>
-        <w:rPr>
-          <w:rFonts w:ascii="Courier New" w:hAnsi="Courier New" w:cs="Courier New"/>
-          <w:sz w:val="20"/>
-          <w:szCs w:val="20"/>
-        </w:rPr>
-        <w:t>"Error cliente:", e)</w:t>
-      </w:r>
-    </w:p>
-    <w:p>
-      <w:pPr>
-        <w:spacing w:line="480" w:lineRule="auto"/>
-        <w:rPr>
-          <w:rFonts w:ascii="Courier New" w:hAnsi="Courier New" w:cs="Courier New"/>
-          <w:sz w:val="20"/>
-          <w:szCs w:val="20"/>
-        </w:rPr>
-      </w:pPr>
-      <w:r>
-        <w:rPr>
-          <w:rFonts w:ascii="Courier New" w:hAnsi="Courier New" w:cs="Courier New"/>
-          <w:sz w:val="20"/>
-          <w:szCs w:val="20"/>
-        </w:rPr>
-        <w:t>    guardar_</w:t>
-      </w:r>
-      <w:proofErr w:type="gramStart"/>
-      <w:r>
-        <w:rPr>
-          <w:rFonts w:ascii="Courier New" w:hAnsi="Courier New" w:cs="Courier New"/>
-          <w:sz w:val="20"/>
-          <w:szCs w:val="20"/>
-        </w:rPr>
-        <w:t>error(</w:t>
-      </w:r>
-      <w:proofErr w:type="gramEnd"/>
-      <w:r>
-        <w:rPr>
-          <w:rFonts w:ascii="Courier New" w:hAnsi="Courier New" w:cs="Courier New"/>
-          <w:sz w:val="20"/>
-          <w:szCs w:val="20"/>
-        </w:rPr>
-        <w:t>"Error cliente: " + str(e))</w:t>
-      </w:r>
-    </w:p>
-    <w:p>
-      <w:pPr>
-        <w:spacing w:line="480" w:lineRule="auto"/>
-        <w:rPr>
-          <w:rFonts w:ascii="Courier New" w:hAnsi="Courier New" w:cs="Courier New"/>
-          <w:sz w:val="20"/>
-          <w:szCs w:val="20"/>
-        </w:rPr>
-      </w:pPr>
-      <w:r>
-        <w:rPr>
-          <w:rFonts w:ascii="Courier New" w:hAnsi="Courier New" w:cs="Courier New"/>
-          <w:sz w:val="20"/>
-          <w:szCs w:val="20"/>
-        </w:rPr>
-        <w:t>finally:</w:t>
-      </w:r>
-    </w:p>
-    <w:p>
-      <w:pPr>
-        <w:spacing w:line="480" w:lineRule="auto"/>
-        <w:rPr>
-          <w:rFonts w:ascii="Courier New" w:hAnsi="Courier New" w:cs="Courier New"/>
-          <w:sz w:val="20"/>
-          <w:szCs w:val="20"/>
-        </w:rPr>
-      </w:pPr>
-      <w:r>
-        <w:rPr>
-          <w:rFonts w:ascii="Courier New" w:hAnsi="Courier New" w:cs="Courier New"/>
-          <w:sz w:val="20"/>
-          <w:szCs w:val="20"/>
-        </w:rPr>
-        <w:t xml:space="preserve">    </w:t>
-      </w:r>
-      <w:proofErr w:type="gramStart"/>
-      <w:r>
-        <w:rPr>
-          <w:rFonts w:ascii="Courier New" w:hAnsi="Courier New" w:cs="Courier New"/>
-          <w:sz w:val="20"/>
-          <w:szCs w:val="20"/>
-        </w:rPr>
-        <w:t>print(</w:t>
-      </w:r>
-      <w:proofErr w:type="gramEnd"/>
-      <w:r>
-        <w:rPr>
-          <w:rFonts w:ascii="Courier New" w:hAnsi="Courier New" w:cs="Courier New"/>
-          <w:sz w:val="20"/>
-          <w:szCs w:val="20"/>
-        </w:rPr>
-        <w:t>"Proceso de clientes finalizado\n")</w:t>
-      </w:r>
-    </w:p>
-    <w:p>
-      <w:pPr>
-        <w:spacing w:line="480" w:lineRule="auto"/>
-        <w:rPr>
-          <w:rFonts w:ascii="Courier New" w:hAnsi="Courier New" w:cs="Courier New"/>
-          <w:sz w:val="20"/>
-          <w:szCs w:val="20"/>
-        </w:rPr>
-      </w:pPr>
-      <w:r>
-        <w:rPr>
-          <w:rFonts w:ascii="Courier New" w:hAnsi="Courier New" w:cs="Courier New"/>
-          <w:sz w:val="20"/>
-          <w:szCs w:val="20"/>
-        </w:rPr>
-        <w:t># ----------- SERVICIOS Y RESERVAS -----------</w:t>
-      </w:r>
-    </w:p>
-    <w:p>
-      <w:pPr>
-        <w:spacing w:line="480" w:lineRule="auto"/>
-        <w:rPr>
-          <w:rFonts w:ascii="Courier New" w:hAnsi="Courier New" w:cs="Courier New"/>
-          <w:sz w:val="20"/>
-          <w:szCs w:val="20"/>
-        </w:rPr>
-      </w:pPr>
-      <w:r>
-        <w:rPr>
-          <w:rFonts w:ascii="Courier New" w:hAnsi="Courier New" w:cs="Courier New"/>
-          <w:sz w:val="20"/>
-          <w:szCs w:val="20"/>
-        </w:rPr>
-        <w:t>try:</w:t>
-      </w:r>
-    </w:p>
-    <w:p>
-      <w:pPr>
-        <w:spacing w:line="480" w:lineRule="auto"/>
-        <w:rPr>
-          <w:rFonts w:ascii="Courier New" w:hAnsi="Courier New" w:cs="Courier New"/>
-          <w:sz w:val="20"/>
-          <w:szCs w:val="20"/>
-        </w:rPr>
-      </w:pPr>
-      <w:r>
-        <w:rPr>
-          <w:rFonts w:ascii="Courier New" w:hAnsi="Courier New" w:cs="Courier New"/>
-          <w:sz w:val="20"/>
-          <w:szCs w:val="20"/>
-        </w:rPr>
-        <w:t xml:space="preserve">    s1 = </w:t>
-      </w:r>
-      <w:proofErr w:type="gramStart"/>
-      <w:r>
-        <w:rPr>
-          <w:rFonts w:ascii="Courier New" w:hAnsi="Courier New" w:cs="Courier New"/>
-          <w:sz w:val="20"/>
-          <w:szCs w:val="20"/>
-        </w:rPr>
-        <w:t>ReservaSala(</w:t>
-      </w:r>
-      <w:proofErr w:type="gramEnd"/>
-      <w:r>
-        <w:rPr>
-          <w:rFonts w:ascii="Courier New" w:hAnsi="Courier New" w:cs="Courier New"/>
-          <w:sz w:val="20"/>
-          <w:szCs w:val="20"/>
-        </w:rPr>
-        <w:t>2)</w:t>
-      </w:r>
-    </w:p>
-    <w:p>
-      <w:pPr>
-        <w:spacing w:line="480" w:lineRule="auto"/>
-        <w:rPr>
-          <w:rFonts w:ascii="Courier New" w:hAnsi="Courier New" w:cs="Courier New"/>
-          <w:sz w:val="20"/>
-          <w:szCs w:val="20"/>
-        </w:rPr>
-      </w:pPr>
-      <w:r>
-        <w:rPr>
-          <w:rFonts w:ascii="Courier New" w:hAnsi="Courier New" w:cs="Courier New"/>
-          <w:sz w:val="20"/>
-          <w:szCs w:val="20"/>
-        </w:rPr>
-        <w:t xml:space="preserve">    </w:t>
-      </w:r>
-      <w:r>
-        <w:rPr>
-          <w:rFonts w:ascii="Courier New" w:hAnsi="Courier New" w:cs="Courier New"/>
-          <w:sz w:val="20"/>
-          <w:szCs w:val="20"/>
-        </w:rPr>
-        <w:t xml:space="preserve">r1 = </w:t>
-      </w:r>
-      <w:proofErr w:type="gramStart"/>
-      <w:r>
-        <w:rPr>
-          <w:rFonts w:ascii="Courier New" w:hAnsi="Courier New" w:cs="Courier New"/>
-          <w:sz w:val="20"/>
-          <w:szCs w:val="20"/>
-        </w:rPr>
-        <w:t>Reserva(</w:t>
-      </w:r>
-      <w:proofErr w:type="gramEnd"/>
-      <w:r>
-        <w:rPr>
-          <w:rFonts w:ascii="Courier New" w:hAnsi="Courier New" w:cs="Courier New"/>
-          <w:sz w:val="20"/>
-          <w:szCs w:val="20"/>
-        </w:rPr>
-        <w:t>c1, s1)</w:t>
-      </w:r>
-    </w:p>
-    <w:p>
-      <w:pPr>
-        <w:spacing w:line="480" w:lineRule="auto"/>
-        <w:rPr>
-          <w:rFonts w:ascii="Courier New" w:hAnsi="Courier New" w:cs="Courier New"/>
-          <w:sz w:val="20"/>
-          <w:szCs w:val="20"/>
-        </w:rPr>
-      </w:pPr>
-      <w:r>
-        <w:rPr>
-          <w:rFonts w:ascii="Courier New" w:hAnsi="Courier New" w:cs="Courier New"/>
-          <w:sz w:val="20"/>
-          <w:szCs w:val="20"/>
-        </w:rPr>
-        <w:t>    r</w:t>
-      </w:r>
-      <w:proofErr w:type="gramStart"/>
-      <w:r>
-        <w:rPr>
-          <w:rFonts w:ascii="Courier New" w:hAnsi="Courier New" w:cs="Courier New"/>
-          <w:sz w:val="20"/>
-          <w:szCs w:val="20"/>
-        </w:rPr>
-        <w:t>1.confirmar</w:t>
-      </w:r>
-      <w:proofErr w:type="gramEnd"/>
-      <w:r>
-        <w:rPr>
-          <w:rFonts w:ascii="Courier New" w:hAnsi="Courier New" w:cs="Courier New"/>
-          <w:sz w:val="20"/>
-          <w:szCs w:val="20"/>
-        </w:rPr>
-        <w:t>()</w:t>
-      </w:r>
-    </w:p>
-    <w:p>
-      <w:pPr>
-        <w:spacing w:line="480" w:lineRule="auto"/>
-        <w:rPr>
-          <w:rFonts w:ascii="Courier New" w:hAnsi="Courier New" w:cs="Courier New"/>
-          <w:sz w:val="20"/>
-          <w:szCs w:val="20"/>
-        </w:rPr>
-      </w:pPr>
-      <w:r>
-        <w:rPr>
-          <w:rFonts w:ascii="Courier New" w:hAnsi="Courier New" w:cs="Courier New"/>
-          <w:sz w:val="20"/>
-          <w:szCs w:val="20"/>
-        </w:rPr>
-        <w:t xml:space="preserve">    </w:t>
-      </w:r>
-      <w:proofErr w:type="gramStart"/>
-      <w:r>
-        <w:rPr>
-          <w:rFonts w:ascii="Courier New" w:hAnsi="Courier New" w:cs="Courier New"/>
-          <w:sz w:val="20"/>
-          <w:szCs w:val="20"/>
-        </w:rPr>
-        <w:t>reservas.append</w:t>
-      </w:r>
-      <w:proofErr w:type="gramEnd"/>
-      <w:r>
-        <w:rPr>
-          <w:rFonts w:ascii="Courier New" w:hAnsi="Courier New" w:cs="Courier New"/>
-          <w:sz w:val="20"/>
-          <w:szCs w:val="20"/>
-        </w:rPr>
-        <w:t>(r1)</w:t>
-      </w:r>
-    </w:p>
-    <w:p>
-      <w:pPr>
-        <w:spacing w:line="480" w:lineRule="auto"/>
-        <w:rPr>
-          <w:rFonts w:ascii="Courier New" w:hAnsi="Courier New" w:cs="Courier New"/>
-          <w:sz w:val="20"/>
-          <w:szCs w:val="20"/>
-        </w:rPr>
-      </w:pPr>
-      <w:r>
-        <w:rPr>
-          <w:rFonts w:ascii="Courier New" w:hAnsi="Courier New" w:cs="Courier New"/>
-          <w:sz w:val="20"/>
-          <w:szCs w:val="20"/>
-        </w:rPr>
-        <w:t xml:space="preserve">    </w:t>
-      </w:r>
-      <w:r>
-        <w:rPr>
-          <w:rFonts w:ascii="Courier New" w:hAnsi="Courier New" w:cs="Courier New"/>
-          <w:sz w:val="20"/>
-          <w:szCs w:val="20"/>
-        </w:rPr>
-        <w:t xml:space="preserve">s2 = </w:t>
-      </w:r>
-      <w:proofErr w:type="gramStart"/>
-      <w:r>
-        <w:rPr>
-          <w:rFonts w:ascii="Courier New" w:hAnsi="Courier New" w:cs="Courier New"/>
-          <w:sz w:val="20"/>
-          <w:szCs w:val="20"/>
-        </w:rPr>
-        <w:t>AlquilerEquipo(</w:t>
-      </w:r>
-      <w:proofErr w:type="gramEnd"/>
-      <w:r>
-        <w:rPr>
-          <w:rFonts w:ascii="Courier New" w:hAnsi="Courier New" w:cs="Courier New"/>
-          <w:sz w:val="20"/>
-          <w:szCs w:val="20"/>
-        </w:rPr>
-        <w:t>3)</w:t>
-      </w:r>
-    </w:p>
-    <w:p>
-      <w:pPr>
-        <w:spacing w:line="480" w:lineRule="auto"/>
-        <w:rPr>
-          <w:rFonts w:ascii="Courier New" w:hAnsi="Courier New" w:cs="Courier New"/>
-          <w:sz w:val="20"/>
-          <w:szCs w:val="20"/>
-        </w:rPr>
-      </w:pPr>
-      <w:r>
-        <w:rPr>
-          <w:rFonts w:ascii="Courier New" w:hAnsi="Courier New" w:cs="Courier New"/>
-          <w:sz w:val="20"/>
-          <w:szCs w:val="20"/>
-        </w:rPr>
-        <w:t xml:space="preserve">    r2 = </w:t>
-      </w:r>
-      <w:proofErr w:type="gramStart"/>
-      <w:r>
-        <w:rPr>
-          <w:rFonts w:ascii="Courier New" w:hAnsi="Courier New" w:cs="Courier New"/>
-          <w:sz w:val="20"/>
-          <w:szCs w:val="20"/>
-        </w:rPr>
-        <w:t>Reserva(</w:t>
-      </w:r>
-      <w:proofErr w:type="gramEnd"/>
-      <w:r>
-        <w:rPr>
-          <w:rFonts w:ascii="Courier New" w:hAnsi="Courier New" w:cs="Courier New"/>
-          <w:sz w:val="20"/>
-          <w:szCs w:val="20"/>
-        </w:rPr>
-        <w:t>c2, s2)</w:t>
-      </w:r>
-    </w:p>
-    <w:p>
-      <w:pPr>
-        <w:spacing w:line="480" w:lineRule="auto"/>
-        <w:rPr>
-          <w:rFonts w:ascii="Courier New" w:hAnsi="Courier New" w:cs="Courier New"/>
-          <w:sz w:val="20"/>
-          <w:szCs w:val="20"/>
-        </w:rPr>
-      </w:pPr>
-      <w:r>
-        <w:rPr>
-          <w:rFonts w:ascii="Courier New" w:hAnsi="Courier New" w:cs="Courier New"/>
-          <w:sz w:val="20"/>
-          <w:szCs w:val="20"/>
-        </w:rPr>
-        <w:t xml:space="preserve">    </w:t>
-      </w:r>
-      <w:proofErr w:type="gramStart"/>
-      <w:r>
-        <w:rPr>
-          <w:rFonts w:ascii="Courier New" w:hAnsi="Courier New" w:cs="Courier New"/>
-          <w:sz w:val="20"/>
-          <w:szCs w:val="20"/>
-        </w:rPr>
-        <w:t>reservas.append</w:t>
-      </w:r>
-      <w:proofErr w:type="gramEnd"/>
-      <w:r>
-        <w:rPr>
-          <w:rFonts w:ascii="Courier New" w:hAnsi="Courier New" w:cs="Courier New"/>
-          <w:sz w:val="20"/>
-          <w:szCs w:val="20"/>
-        </w:rPr>
-        <w:t>(r2)</w:t>
-      </w:r>
-    </w:p>
-    <w:p>
-      <w:pPr>
-        <w:spacing w:line="480" w:lineRule="auto"/>
-        <w:rPr>
-          <w:rFonts w:ascii="Courier New" w:hAnsi="Courier New" w:cs="Courier New"/>
-          <w:sz w:val="20"/>
-          <w:szCs w:val="20"/>
-        </w:rPr>
-      </w:pPr>
-      <w:r>
-        <w:rPr>
-          <w:rFonts w:ascii="Courier New" w:hAnsi="Courier New" w:cs="Courier New"/>
-          <w:sz w:val="20"/>
-          <w:szCs w:val="20"/>
-        </w:rPr>
-        <w:t xml:space="preserve">    s3 = </w:t>
-      </w:r>
-      <w:proofErr w:type="gramStart"/>
-      <w:r>
-        <w:rPr>
-          <w:rFonts w:ascii="Courier New" w:hAnsi="Courier New" w:cs="Courier New"/>
-          <w:sz w:val="20"/>
-          <w:szCs w:val="20"/>
-        </w:rPr>
-        <w:t>Asesoria(</w:t>
-      </w:r>
-      <w:proofErr w:type="gramEnd"/>
-      <w:r>
-        <w:rPr>
-          <w:rFonts w:ascii="Courier New" w:hAnsi="Courier New" w:cs="Courier New"/>
-          <w:sz w:val="20"/>
-          <w:szCs w:val="20"/>
-        </w:rPr>
-        <w:t>1)</w:t>
-      </w:r>
-    </w:p>
-    <w:p>
-      <w:pPr>
-        <w:spacing w:line="480" w:lineRule="auto"/>
-        <w:rPr>
-          <w:rFonts w:ascii="Courier New" w:hAnsi="Courier New" w:cs="Courier New"/>
-          <w:sz w:val="20"/>
-          <w:szCs w:val="20"/>
-        </w:rPr>
-      </w:pPr>
-      <w:r>
-        <w:rPr>
-          <w:rFonts w:ascii="Courier New" w:hAnsi="Courier New" w:cs="Courier New"/>
-          <w:sz w:val="20"/>
-          <w:szCs w:val="20"/>
-        </w:rPr>
-        <w:t xml:space="preserve">    r3 = </w:t>
-      </w:r>
-      <w:proofErr w:type="gramStart"/>
-      <w:r>
-        <w:rPr>
-          <w:rFonts w:ascii="Courier New" w:hAnsi="Courier New" w:cs="Courier New"/>
-          <w:sz w:val="20"/>
-          <w:szCs w:val="20"/>
-        </w:rPr>
-        <w:t>Reserva(</w:t>
-      </w:r>
-      <w:proofErr w:type="gramEnd"/>
-      <w:r>
-        <w:rPr>
-          <w:rFonts w:ascii="Courier New" w:hAnsi="Courier New" w:cs="Courier New"/>
-          <w:sz w:val="20"/>
-          <w:szCs w:val="20"/>
-        </w:rPr>
-        <w:t>c3, s3)</w:t>
-      </w:r>
-    </w:p>
-    <w:p>
-      <w:pPr>
-        <w:spacing w:line="480" w:lineRule="auto"/>
-        <w:rPr>
-          <w:rFonts w:ascii="Courier New" w:hAnsi="Courier New" w:cs="Courier New"/>
-          <w:sz w:val="20"/>
-          <w:szCs w:val="20"/>
-        </w:rPr>
-      </w:pPr>
-      <w:r>
-        <w:rPr>
-          <w:rFonts w:ascii="Courier New" w:hAnsi="Courier New" w:cs="Courier New"/>
-          <w:sz w:val="20"/>
-          <w:szCs w:val="20"/>
-        </w:rPr>
-        <w:t>    r</w:t>
-      </w:r>
-      <w:proofErr w:type="gramStart"/>
-      <w:r>
-        <w:rPr>
-          <w:rFonts w:ascii="Courier New" w:hAnsi="Courier New" w:cs="Courier New"/>
-          <w:sz w:val="20"/>
-          <w:szCs w:val="20"/>
-        </w:rPr>
-        <w:t>3.confirmar</w:t>
-      </w:r>
-      <w:proofErr w:type="gramEnd"/>
-      <w:r>
-        <w:rPr>
-          <w:rFonts w:ascii="Courier New" w:hAnsi="Courier New" w:cs="Courier New"/>
-          <w:sz w:val="20"/>
-          <w:szCs w:val="20"/>
-        </w:rPr>
-        <w:t>()</w:t>
+      <w:r>
+        <w:rPr>
+          <w:rFonts w:ascii="Courier New" w:hAnsi="Courier New" w:cs="Courier New"/>
+          <w:sz w:val="20"/>
+          <w:szCs w:val="20"/>
+        </w:rPr>
+        <w:t>reservas.append(r2)</w:t>
+      </w:r>
+    </w:p>
+    <w:p>
+      <w:pPr>
+        <w:spacing w:line="480" w:lineRule="auto"/>
+        <w:rPr>
+          <w:rFonts w:ascii="Courier New" w:hAnsi="Courier New" w:cs="Courier New"/>
+          <w:sz w:val="20"/>
+          <w:szCs w:val="20"/>
+        </w:rPr>
+      </w:pPr>
+      <w:r>
+        <w:rPr>
+          <w:rFonts w:ascii="Courier New" w:hAnsi="Courier New" w:cs="Courier New"/>
+          <w:sz w:val="20"/>
+          <w:szCs w:val="20"/>
+        </w:rPr>
+        <w:t>    s3 = Asesoria(1)</w:t>
+      </w:r>
+    </w:p>
+    <w:p>
+      <w:pPr>
+        <w:spacing w:line="480" w:lineRule="auto"/>
+        <w:rPr>
+          <w:rFonts w:ascii="Courier New" w:hAnsi="Courier New" w:cs="Courier New"/>
+          <w:sz w:val="20"/>
+          <w:szCs w:val="20"/>
+        </w:rPr>
+      </w:pPr>
+      <w:r>
+        <w:rPr>
+          <w:rFonts w:ascii="Courier New" w:hAnsi="Courier New" w:cs="Courier New"/>
+          <w:sz w:val="20"/>
+          <w:szCs w:val="20"/>
+        </w:rPr>
+        <w:t>    r3 = Reserva(c3, s3)</w:t>
+      </w:r>
+    </w:p>
+    <w:p>
+      <w:pPr>
+        <w:spacing w:line="480" w:lineRule="auto"/>
+        <w:rPr>
+          <w:rFonts w:ascii="Courier New" w:hAnsi="Courier New" w:cs="Courier New"/>
+          <w:sz w:val="20"/>
+          <w:szCs w:val="20"/>
+        </w:rPr>
+      </w:pPr>
+      <w:r>
+        <w:rPr>
+          <w:rFonts w:ascii="Courier New" w:hAnsi="Courier New" w:cs="Courier New"/>
+          <w:sz w:val="20"/>
+          <w:szCs w:val="20"/>
+        </w:rPr>
+        <w:t>    r3.confirmar()</w:t>
       </w:r>
     </w:p>
     <w:p>
@@ -4569,25 +3378,14 @@
         <w:lastRenderedPageBreak/>
         <w:t xml:space="preserve">    </w:t>
       </w:r>
-      <w:proofErr w:type="gramStart"/>
-      <w:r>
-        <w:rPr>
-          <w:rFonts w:ascii="Courier New" w:hAnsi="Courier New" w:cs="Courier New"/>
-          <w:sz w:val="20"/>
-          <w:szCs w:val="20"/>
-          <w:lang w:val="en-US"/>
-        </w:rPr>
-        <w:t>reservas.append</w:t>
-      </w:r>
-      <w:proofErr w:type="gramEnd"/>
-      <w:r>
-        <w:rPr>
-          <w:rFonts w:ascii="Courier New" w:hAnsi="Courier New" w:cs="Courier New"/>
-          <w:sz w:val="20"/>
-          <w:szCs w:val="20"/>
-          <w:lang w:val="en-US"/>
-        </w:rPr>
-        <w:t>(r3)</w:t>
+      <w:r>
+        <w:rPr>
+          <w:rFonts w:ascii="Courier New" w:hAnsi="Courier New" w:cs="Courier New"/>
+          <w:sz w:val="20"/>
+          <w:szCs w:val="20"/>
+          <w:lang w:val="en-US"/>
+        </w:rPr>
+        <w:t>reservas.append(r3)</w:t>
       </w:r>
     </w:p>
     <w:p>
@@ -4616,87 +3414,27 @@
           <w:szCs w:val="20"/>
           <w:lang w:val="en-US"/>
         </w:rPr>
-        <w:t xml:space="preserve">s4 = </w:t>
-      </w:r>
-      <w:proofErr w:type="gramStart"/>
-      <w:r>
-        <w:rPr>
-          <w:rFonts w:ascii="Courier New" w:hAnsi="Courier New" w:cs="Courier New"/>
-          <w:sz w:val="20"/>
-          <w:szCs w:val="20"/>
-          <w:lang w:val="en-US"/>
-        </w:rPr>
-        <w:t>ReservaSala(</w:t>
-      </w:r>
-      <w:proofErr w:type="gramEnd"/>
-      <w:r>
-        <w:rPr>
-          <w:rFonts w:ascii="Courier New" w:hAnsi="Courier New" w:cs="Courier New"/>
-          <w:sz w:val="20"/>
-          <w:szCs w:val="20"/>
-          <w:lang w:val="en-US"/>
-        </w:rPr>
-        <w:t>-2</w:t>
-      </w:r>
-      <w:proofErr w:type="gramStart"/>
-      <w:r>
-        <w:rPr>
-          <w:rFonts w:ascii="Courier New" w:hAnsi="Courier New" w:cs="Courier New"/>
-          <w:sz w:val="20"/>
-          <w:szCs w:val="20"/>
-          <w:lang w:val="en-US"/>
-        </w:rPr>
-        <w:t>)  #</w:t>
-      </w:r>
-      <w:proofErr w:type="gramEnd"/>
-      <w:r>
-        <w:rPr>
-          <w:rFonts w:ascii="Courier New" w:hAnsi="Courier New" w:cs="Courier New"/>
-          <w:sz w:val="20"/>
-          <w:szCs w:val="20"/>
-          <w:lang w:val="en-US"/>
-        </w:rPr>
-        <w:t xml:space="preserve"> ERROR</w:t>
-      </w:r>
-    </w:p>
-    <w:p>
-      <w:pPr>
-        <w:spacing w:line="480" w:lineRule="auto"/>
-        <w:rPr>
-          <w:rFonts w:ascii="Courier New" w:hAnsi="Courier New" w:cs="Courier New"/>
-          <w:sz w:val="20"/>
-          <w:szCs w:val="20"/>
-          <w:lang w:val="en-US"/>
-        </w:rPr>
-      </w:pPr>
-      <w:r>
-        <w:rPr>
-          <w:rFonts w:ascii="Courier New" w:hAnsi="Courier New" w:cs="Courier New"/>
-          <w:sz w:val="20"/>
-          <w:szCs w:val="20"/>
-          <w:lang w:val="en-US"/>
-        </w:rPr>
-        <w:t xml:space="preserve">    r4 = </w:t>
-      </w:r>
-      <w:proofErr w:type="gramStart"/>
-      <w:r>
-        <w:rPr>
-          <w:rFonts w:ascii="Courier New" w:hAnsi="Courier New" w:cs="Courier New"/>
-          <w:sz w:val="20"/>
-          <w:szCs w:val="20"/>
-          <w:lang w:val="en-US"/>
-        </w:rPr>
-        <w:t>Reserva(</w:t>
-      </w:r>
-      <w:proofErr w:type="gramEnd"/>
-      <w:r>
-        <w:rPr>
-          <w:rFonts w:ascii="Courier New" w:hAnsi="Courier New" w:cs="Courier New"/>
-          <w:sz w:val="20"/>
-          <w:szCs w:val="20"/>
-          <w:lang w:val="en-US"/>
-        </w:rPr>
-        <w:t>c1, s4)</w:t>
+        <w:t>s4 = ReservaSala(-2)  # ERROR</w:t>
+      </w:r>
+    </w:p>
+    <w:p>
+      <w:pPr>
+        <w:spacing w:line="480" w:lineRule="auto"/>
+        <w:rPr>
+          <w:rFonts w:ascii="Courier New" w:hAnsi="Courier New" w:cs="Courier New"/>
+          <w:sz w:val="20"/>
+          <w:szCs w:val="20"/>
+          <w:lang w:val="en-US"/>
+        </w:rPr>
+      </w:pPr>
+      <w:r>
+        <w:rPr>
+          <w:rFonts w:ascii="Courier New" w:hAnsi="Courier New" w:cs="Courier New"/>
+          <w:sz w:val="20"/>
+          <w:szCs w:val="20"/>
+          <w:lang w:val="en-US"/>
+        </w:rPr>
+        <w:t>    r4 = Reserva(c1, s4)</w:t>
       </w:r>
     </w:p>
     <w:p>
@@ -4718,25 +3456,14 @@
         </w:rPr>
         <w:t xml:space="preserve">    </w:t>
       </w:r>
-      <w:proofErr w:type="gramStart"/>
-      <w:r>
-        <w:rPr>
-          <w:rFonts w:ascii="Courier New" w:hAnsi="Courier New" w:cs="Courier New"/>
-          <w:sz w:val="20"/>
-          <w:szCs w:val="20"/>
-          <w:lang w:val="en-US"/>
-        </w:rPr>
-        <w:t>reservas.append</w:t>
-      </w:r>
-      <w:proofErr w:type="gramEnd"/>
-      <w:r>
-        <w:rPr>
-          <w:rFonts w:ascii="Courier New" w:hAnsi="Courier New" w:cs="Courier New"/>
-          <w:sz w:val="20"/>
-          <w:szCs w:val="20"/>
-          <w:lang w:val="en-US"/>
-        </w:rPr>
-        <w:t>(r4)</w:t>
+      <w:r>
+        <w:rPr>
+          <w:rFonts w:ascii="Courier New" w:hAnsi="Courier New" w:cs="Courier New"/>
+          <w:sz w:val="20"/>
+          <w:szCs w:val="20"/>
+          <w:lang w:val="en-US"/>
+        </w:rPr>
+        <w:t>reservas.append(r4)</w:t>
       </w:r>
     </w:p>
     <w:p>
@@ -4763,61 +3490,25 @@
           <w:sz w:val="20"/>
           <w:szCs w:val="20"/>
         </w:rPr>
-        <w:t xml:space="preserve">s5 = </w:t>
-      </w:r>
-      <w:proofErr w:type="gramStart"/>
-      <w:r>
-        <w:rPr>
-          <w:rFonts w:ascii="Courier New" w:hAnsi="Courier New" w:cs="Courier New"/>
-          <w:sz w:val="20"/>
-          <w:szCs w:val="20"/>
-        </w:rPr>
-        <w:t>AlquilerEquipo(</w:t>
-      </w:r>
-      <w:proofErr w:type="gramEnd"/>
-      <w:r>
-        <w:rPr>
-          <w:rFonts w:ascii="Courier New" w:hAnsi="Courier New" w:cs="Courier New"/>
-          <w:sz w:val="20"/>
-          <w:szCs w:val="20"/>
-        </w:rPr>
-        <w:t>5)</w:t>
-      </w:r>
-    </w:p>
-    <w:p>
-      <w:pPr>
-        <w:spacing w:line="480" w:lineRule="auto"/>
-        <w:rPr>
-          <w:rFonts w:ascii="Courier New" w:hAnsi="Courier New" w:cs="Courier New"/>
-          <w:sz w:val="20"/>
-          <w:szCs w:val="20"/>
-        </w:rPr>
-      </w:pPr>
-      <w:r>
-        <w:rPr>
-          <w:rFonts w:ascii="Courier New" w:hAnsi="Courier New" w:cs="Courier New"/>
-          <w:sz w:val="20"/>
-          <w:szCs w:val="20"/>
-        </w:rPr>
-        <w:t xml:space="preserve">    r5 = </w:t>
-      </w:r>
-      <w:proofErr w:type="gramStart"/>
-      <w:r>
-        <w:rPr>
-          <w:rFonts w:ascii="Courier New" w:hAnsi="Courier New" w:cs="Courier New"/>
-          <w:sz w:val="20"/>
-          <w:szCs w:val="20"/>
-        </w:rPr>
-        <w:t>Reserva(</w:t>
-      </w:r>
-      <w:proofErr w:type="gramEnd"/>
-      <w:r>
-        <w:rPr>
-          <w:rFonts w:ascii="Courier New" w:hAnsi="Courier New" w:cs="Courier New"/>
-          <w:sz w:val="20"/>
-          <w:szCs w:val="20"/>
-        </w:rPr>
-        <w:t>c2, s5)</w:t>
+        <w:t>s5 = AlquilerEquipo(5)</w:t>
+      </w:r>
+    </w:p>
+    <w:p>
+      <w:pPr>
+        <w:spacing w:line="480" w:lineRule="auto"/>
+        <w:rPr>
+          <w:rFonts w:ascii="Courier New" w:hAnsi="Courier New" w:cs="Courier New"/>
+          <w:sz w:val="20"/>
+          <w:szCs w:val="20"/>
+        </w:rPr>
+      </w:pPr>
+      <w:r>
+        <w:rPr>
+          <w:rFonts w:ascii="Courier New" w:hAnsi="Courier New" w:cs="Courier New"/>
+          <w:sz w:val="20"/>
+          <w:szCs w:val="20"/>
+        </w:rPr>
+        <w:t>    r5 = Reserva(c2, s5)</w:t>
       </w:r>
     </w:p>
     <w:p>
@@ -4845,37 +3536,36 @@
           <w:szCs w:val="20"/>
           <w:lang w:val="en-US"/>
         </w:rPr>
-        <w:t>r</w:t>
-      </w:r>
-      <w:proofErr w:type="gramStart"/>
-      <w:r>
-        <w:rPr>
-          <w:rFonts w:ascii="Courier New" w:hAnsi="Courier New" w:cs="Courier New"/>
-          <w:sz w:val="20"/>
-          <w:szCs w:val="20"/>
-          <w:lang w:val="en-US"/>
-        </w:rPr>
-        <w:t>5.cancelar</w:t>
-      </w:r>
-      <w:proofErr w:type="gramEnd"/>
-      <w:r>
-        <w:rPr>
-          <w:rFonts w:ascii="Courier New" w:hAnsi="Courier New" w:cs="Courier New"/>
-          <w:sz w:val="20"/>
-          <w:szCs w:val="20"/>
-          <w:lang w:val="en-US"/>
-        </w:rPr>
-        <w:t>()</w:t>
-      </w:r>
-    </w:p>
-    <w:p>
-      <w:pPr>
-        <w:spacing w:line="480" w:lineRule="auto"/>
-        <w:rPr>
-          <w:rFonts w:ascii="Courier New" w:hAnsi="Courier New" w:cs="Courier New"/>
-          <w:sz w:val="20"/>
-          <w:szCs w:val="20"/>
-          <w:lang w:val="en-US"/>
+        <w:t>r5.cancelar()</w:t>
+      </w:r>
+    </w:p>
+    <w:p>
+      <w:pPr>
+        <w:spacing w:line="480" w:lineRule="auto"/>
+        <w:rPr>
+          <w:rFonts w:ascii="Courier New" w:hAnsi="Courier New" w:cs="Courier New"/>
+          <w:sz w:val="20"/>
+          <w:szCs w:val="20"/>
+          <w:lang w:val="en-US"/>
+        </w:rPr>
+      </w:pPr>
+      <w:r>
+        <w:rPr>
+          <w:rFonts w:ascii="Courier New" w:hAnsi="Courier New" w:cs="Courier New"/>
+          <w:sz w:val="20"/>
+          <w:szCs w:val="20"/>
+          <w:lang w:val="en-US"/>
+        </w:rPr>
+        <w:t>    reservas.append(r5)</w:t>
+      </w:r>
+    </w:p>
+    <w:p>
+      <w:pPr>
+        <w:spacing w:line="480" w:lineRule="auto"/>
+        <w:rPr>
+          <w:rFonts w:ascii="Courier New" w:hAnsi="Courier New" w:cs="Courier New"/>
+          <w:sz w:val="20"/>
+          <w:szCs w:val="20"/>
         </w:rPr>
       </w:pPr>
       <w:r>
@@ -4887,42 +3577,210 @@
         </w:rPr>
         <w:t xml:space="preserve">    </w:t>
       </w:r>
-      <w:proofErr w:type="gramStart"/>
-      <w:r>
-        <w:rPr>
-          <w:rFonts w:ascii="Courier New" w:hAnsi="Courier New" w:cs="Courier New"/>
-          <w:sz w:val="20"/>
-          <w:szCs w:val="20"/>
-          <w:lang w:val="en-US"/>
-        </w:rPr>
-        <w:t>reservas.append</w:t>
-      </w:r>
-      <w:proofErr w:type="gramEnd"/>
-      <w:r>
-        <w:rPr>
-          <w:rFonts w:ascii="Courier New" w:hAnsi="Courier New" w:cs="Courier New"/>
-          <w:sz w:val="20"/>
-          <w:szCs w:val="20"/>
-          <w:lang w:val="en-US"/>
-        </w:rPr>
-        <w:t>(r5)</w:t>
-      </w:r>
-    </w:p>
-    <w:p>
-      <w:pPr>
-        <w:spacing w:line="480" w:lineRule="auto"/>
-        <w:rPr>
-          <w:rFonts w:ascii="Courier New" w:hAnsi="Courier New" w:cs="Courier New"/>
-          <w:sz w:val="20"/>
-          <w:szCs w:val="20"/>
-        </w:rPr>
-      </w:pPr>
-      <w:r>
-        <w:rPr>
-          <w:rFonts w:ascii="Courier New" w:hAnsi="Courier New" w:cs="Courier New"/>
-          <w:sz w:val="20"/>
-          <w:szCs w:val="20"/>
-          <w:lang w:val="en-US"/>
+      <w:r>
+        <w:rPr>
+          <w:rFonts w:ascii="Courier New" w:hAnsi="Courier New" w:cs="Courier New"/>
+          <w:sz w:val="20"/>
+          <w:szCs w:val="20"/>
+        </w:rPr>
+        <w:t>s6 = Asesoria(-1)  # ERROR</w:t>
+      </w:r>
+    </w:p>
+    <w:p>
+      <w:pPr>
+        <w:spacing w:line="480" w:lineRule="auto"/>
+        <w:rPr>
+          <w:rFonts w:ascii="Courier New" w:hAnsi="Courier New" w:cs="Courier New"/>
+          <w:sz w:val="20"/>
+          <w:szCs w:val="20"/>
+        </w:rPr>
+      </w:pPr>
+      <w:r>
+        <w:rPr>
+          <w:rFonts w:ascii="Courier New" w:hAnsi="Courier New" w:cs="Courier New"/>
+          <w:sz w:val="20"/>
+          <w:szCs w:val="20"/>
+        </w:rPr>
+        <w:t>    r6 = Reserva(c3, s6)</w:t>
+      </w:r>
+    </w:p>
+    <w:p>
+      <w:pPr>
+        <w:spacing w:line="480" w:lineRule="auto"/>
+        <w:rPr>
+          <w:rFonts w:ascii="Courier New" w:hAnsi="Courier New" w:cs="Courier New"/>
+          <w:sz w:val="20"/>
+          <w:szCs w:val="20"/>
+        </w:rPr>
+      </w:pPr>
+      <w:r>
+        <w:rPr>
+          <w:rFonts w:ascii="Courier New" w:hAnsi="Courier New" w:cs="Courier New"/>
+          <w:sz w:val="20"/>
+          <w:szCs w:val="20"/>
+        </w:rPr>
+        <w:t>    reservas.append(r6)</w:t>
+      </w:r>
+    </w:p>
+    <w:p>
+      <w:pPr>
+        <w:spacing w:line="480" w:lineRule="auto"/>
+        <w:rPr>
+          <w:rFonts w:ascii="Courier New" w:hAnsi="Courier New" w:cs="Courier New"/>
+          <w:sz w:val="20"/>
+          <w:szCs w:val="20"/>
+        </w:rPr>
+      </w:pPr>
+      <w:r>
+        <w:rPr>
+          <w:rFonts w:ascii="Courier New" w:hAnsi="Courier New" w:cs="Courier New"/>
+          <w:sz w:val="20"/>
+          <w:szCs w:val="20"/>
+        </w:rPr>
+        <w:t>except (ErrorServicio, ErrorReserva) as e:</w:t>
+      </w:r>
+    </w:p>
+    <w:p>
+      <w:pPr>
+        <w:spacing w:line="480" w:lineRule="auto"/>
+        <w:rPr>
+          <w:rFonts w:ascii="Courier New" w:hAnsi="Courier New" w:cs="Courier New"/>
+          <w:sz w:val="20"/>
+          <w:szCs w:val="20"/>
+        </w:rPr>
+      </w:pPr>
+      <w:r>
+        <w:rPr>
+          <w:rFonts w:ascii="Courier New" w:hAnsi="Courier New" w:cs="Courier New"/>
+          <w:sz w:val="20"/>
+          <w:szCs w:val="20"/>
+        </w:rPr>
+        <w:t>    print("Error reserva:", e)</w:t>
+      </w:r>
+    </w:p>
+    <w:p>
+      <w:pPr>
+        <w:spacing w:line="480" w:lineRule="auto"/>
+        <w:rPr>
+          <w:rFonts w:ascii="Courier New" w:hAnsi="Courier New" w:cs="Courier New"/>
+          <w:sz w:val="20"/>
+          <w:szCs w:val="20"/>
+        </w:rPr>
+      </w:pPr>
+      <w:r>
+        <w:rPr>
+          <w:rFonts w:ascii="Courier New" w:hAnsi="Courier New" w:cs="Courier New"/>
+          <w:sz w:val="20"/>
+          <w:szCs w:val="20"/>
+        </w:rPr>
+        <w:t>    guardar_error("Error reserva: " + str(e))</w:t>
+      </w:r>
+    </w:p>
+    <w:p>
+      <w:pPr>
+        <w:spacing w:line="480" w:lineRule="auto"/>
+        <w:rPr>
+          <w:rFonts w:ascii="Courier New" w:hAnsi="Courier New" w:cs="Courier New"/>
+          <w:sz w:val="20"/>
+          <w:szCs w:val="20"/>
+        </w:rPr>
+      </w:pPr>
+      <w:r>
+        <w:rPr>
+          <w:rFonts w:ascii="Courier New" w:hAnsi="Courier New" w:cs="Courier New"/>
+          <w:sz w:val="20"/>
+          <w:szCs w:val="20"/>
+        </w:rPr>
+        <w:t>finally:</w:t>
+      </w:r>
+    </w:p>
+    <w:p>
+      <w:pPr>
+        <w:spacing w:line="480" w:lineRule="auto"/>
+        <w:rPr>
+          <w:rFonts w:ascii="Courier New" w:hAnsi="Courier New" w:cs="Courier New"/>
+          <w:sz w:val="20"/>
+          <w:szCs w:val="20"/>
+        </w:rPr>
+      </w:pPr>
+      <w:r>
+        <w:rPr>
+          <w:rFonts w:ascii="Courier New" w:hAnsi="Courier New" w:cs="Courier New"/>
+          <w:sz w:val="20"/>
+          <w:szCs w:val="20"/>
+        </w:rPr>
+        <w:t>    print("Proceso de reservas finalizado\n")</w:t>
+      </w:r>
+    </w:p>
+    <w:p>
+      <w:pPr>
+        <w:spacing w:line="480" w:lineRule="auto"/>
+        <w:rPr>
+          <w:rFonts w:ascii="Courier New" w:hAnsi="Courier New" w:cs="Courier New"/>
+          <w:sz w:val="20"/>
+          <w:szCs w:val="20"/>
+        </w:rPr>
+      </w:pPr>
+      <w:r>
+        <w:rPr>
+          <w:rFonts w:ascii="Courier New" w:hAnsi="Courier New" w:cs="Courier New"/>
+          <w:sz w:val="20"/>
+          <w:szCs w:val="20"/>
+        </w:rPr>
+        <w:t># ----------- MOSTRAR RESULTADOS -----------</w:t>
+      </w:r>
+    </w:p>
+    <w:p>
+      <w:pPr>
+        <w:spacing w:line="480" w:lineRule="auto"/>
+        <w:rPr>
+          <w:rFonts w:ascii="Courier New" w:hAnsi="Courier New" w:cs="Courier New"/>
+          <w:sz w:val="20"/>
+          <w:szCs w:val="20"/>
+        </w:rPr>
+      </w:pPr>
+      <w:r>
+        <w:rPr>
+          <w:rFonts w:ascii="Courier New" w:hAnsi="Courier New" w:cs="Courier New"/>
+          <w:sz w:val="20"/>
+          <w:szCs w:val="20"/>
+        </w:rPr>
+        <w:t>print("--- RESERVAS VALIDAS ---\n")</w:t>
+      </w:r>
+    </w:p>
+    <w:p>
+      <w:pPr>
+        <w:spacing w:line="480" w:lineRule="auto"/>
+        <w:rPr>
+          <w:rFonts w:ascii="Courier New" w:hAnsi="Courier New" w:cs="Courier New"/>
+          <w:sz w:val="20"/>
+          <w:szCs w:val="20"/>
+        </w:rPr>
+      </w:pPr>
+      <w:r>
+        <w:rPr>
+          <w:rFonts w:ascii="Courier New" w:hAnsi="Courier New" w:cs="Courier New"/>
+          <w:sz w:val="20"/>
+          <w:szCs w:val="20"/>
+        </w:rPr>
+        <w:t>for r in reservas:</w:t>
+      </w:r>
+    </w:p>
+    <w:p>
+      <w:pPr>
+        <w:spacing w:line="480" w:lineRule="auto"/>
+        <w:rPr>
+          <w:rFonts w:ascii="Courier New" w:hAnsi="Courier New" w:cs="Courier New"/>
+          <w:sz w:val="20"/>
+          <w:szCs w:val="20"/>
+          <w:lang w:val="en-US"/>
+        </w:rPr>
+      </w:pPr>
+      <w:r>
+        <w:rPr>
+          <w:rFonts w:ascii="Courier New" w:hAnsi="Courier New" w:cs="Courier New"/>
+          <w:sz w:val="20"/>
+          <w:szCs w:val="20"/>
         </w:rPr>
         <w:t xml:space="preserve">    </w:t>
       </w:r>
@@ -4931,349 +3789,6 @@
           <w:rFonts w:ascii="Courier New" w:hAnsi="Courier New" w:cs="Courier New"/>
           <w:sz w:val="20"/>
           <w:szCs w:val="20"/>
-        </w:rPr>
-        <w:t xml:space="preserve">s6 = </w:t>
-      </w:r>
-      <w:proofErr w:type="gramStart"/>
-      <w:r>
-        <w:rPr>
-          <w:rFonts w:ascii="Courier New" w:hAnsi="Courier New" w:cs="Courier New"/>
-          <w:sz w:val="20"/>
-          <w:szCs w:val="20"/>
-        </w:rPr>
-        <w:t>Asesoria(</w:t>
-      </w:r>
-      <w:proofErr w:type="gramEnd"/>
-      <w:r>
-        <w:rPr>
-          <w:rFonts w:ascii="Courier New" w:hAnsi="Courier New" w:cs="Courier New"/>
-          <w:sz w:val="20"/>
-          <w:szCs w:val="20"/>
-        </w:rPr>
-        <w:t>-1</w:t>
-      </w:r>
-      <w:proofErr w:type="gramStart"/>
-      <w:r>
-        <w:rPr>
-          <w:rFonts w:ascii="Courier New" w:hAnsi="Courier New" w:cs="Courier New"/>
-          <w:sz w:val="20"/>
-          <w:szCs w:val="20"/>
-        </w:rPr>
-        <w:t>)  #</w:t>
-      </w:r>
-      <w:proofErr w:type="gramEnd"/>
-      <w:r>
-        <w:rPr>
-          <w:rFonts w:ascii="Courier New" w:hAnsi="Courier New" w:cs="Courier New"/>
-          <w:sz w:val="20"/>
-          <w:szCs w:val="20"/>
-        </w:rPr>
-        <w:t xml:space="preserve"> ERROR</w:t>
-      </w:r>
-    </w:p>
-    <w:p>
-      <w:pPr>
-        <w:spacing w:line="480" w:lineRule="auto"/>
-        <w:rPr>
-          <w:rFonts w:ascii="Courier New" w:hAnsi="Courier New" w:cs="Courier New"/>
-          <w:sz w:val="20"/>
-          <w:szCs w:val="20"/>
-        </w:rPr>
-      </w:pPr>
-      <w:r>
-        <w:rPr>
-          <w:rFonts w:ascii="Courier New" w:hAnsi="Courier New" w:cs="Courier New"/>
-          <w:sz w:val="20"/>
-          <w:szCs w:val="20"/>
-        </w:rPr>
-        <w:t xml:space="preserve">    r6 = </w:t>
-      </w:r>
-      <w:proofErr w:type="gramStart"/>
-      <w:r>
-        <w:rPr>
-          <w:rFonts w:ascii="Courier New" w:hAnsi="Courier New" w:cs="Courier New"/>
-          <w:sz w:val="20"/>
-          <w:szCs w:val="20"/>
-        </w:rPr>
-        <w:t>Reserva(</w:t>
-      </w:r>
-      <w:proofErr w:type="gramEnd"/>
-      <w:r>
-        <w:rPr>
-          <w:rFonts w:ascii="Courier New" w:hAnsi="Courier New" w:cs="Courier New"/>
-          <w:sz w:val="20"/>
-          <w:szCs w:val="20"/>
-        </w:rPr>
-        <w:t>c3, s6)</w:t>
-      </w:r>
-    </w:p>
-    <w:p>
-      <w:pPr>
-        <w:spacing w:line="480" w:lineRule="auto"/>
-        <w:rPr>
-          <w:rFonts w:ascii="Courier New" w:hAnsi="Courier New" w:cs="Courier New"/>
-          <w:sz w:val="20"/>
-          <w:szCs w:val="20"/>
-        </w:rPr>
-      </w:pPr>
-      <w:r>
-        <w:rPr>
-          <w:rFonts w:ascii="Courier New" w:hAnsi="Courier New" w:cs="Courier New"/>
-          <w:sz w:val="20"/>
-          <w:szCs w:val="20"/>
-        </w:rPr>
-        <w:t xml:space="preserve">    </w:t>
-      </w:r>
-      <w:proofErr w:type="gramStart"/>
-      <w:r>
-        <w:rPr>
-          <w:rFonts w:ascii="Courier New" w:hAnsi="Courier New" w:cs="Courier New"/>
-          <w:sz w:val="20"/>
-          <w:szCs w:val="20"/>
-        </w:rPr>
-        <w:t>reservas.append</w:t>
-      </w:r>
-      <w:proofErr w:type="gramEnd"/>
-      <w:r>
-        <w:rPr>
-          <w:rFonts w:ascii="Courier New" w:hAnsi="Courier New" w:cs="Courier New"/>
-          <w:sz w:val="20"/>
-          <w:szCs w:val="20"/>
-        </w:rPr>
-        <w:t>(r6)</w:t>
-      </w:r>
-    </w:p>
-    <w:p>
-      <w:pPr>
-        <w:spacing w:line="480" w:lineRule="auto"/>
-        <w:rPr>
-          <w:rFonts w:ascii="Courier New" w:hAnsi="Courier New" w:cs="Courier New"/>
-          <w:sz w:val="20"/>
-          <w:szCs w:val="20"/>
-        </w:rPr>
-      </w:pPr>
-      <w:r>
-        <w:rPr>
-          <w:rFonts w:ascii="Courier New" w:hAnsi="Courier New" w:cs="Courier New"/>
-          <w:sz w:val="20"/>
-          <w:szCs w:val="20"/>
-        </w:rPr>
-        <w:t>except (ErrorServicio, ErrorReserva) as e:</w:t>
-      </w:r>
-    </w:p>
-    <w:p>
-      <w:pPr>
-        <w:spacing w:line="480" w:lineRule="auto"/>
-        <w:rPr>
-          <w:rFonts w:ascii="Courier New" w:hAnsi="Courier New" w:cs="Courier New"/>
-          <w:sz w:val="20"/>
-          <w:szCs w:val="20"/>
-        </w:rPr>
-      </w:pPr>
-      <w:r>
-        <w:rPr>
-          <w:rFonts w:ascii="Courier New" w:hAnsi="Courier New" w:cs="Courier New"/>
-          <w:sz w:val="20"/>
-          <w:szCs w:val="20"/>
-        </w:rPr>
-        <w:t xml:space="preserve">    </w:t>
-      </w:r>
-      <w:proofErr w:type="gramStart"/>
-      <w:r>
-        <w:rPr>
-          <w:rFonts w:ascii="Courier New" w:hAnsi="Courier New" w:cs="Courier New"/>
-          <w:sz w:val="20"/>
-          <w:szCs w:val="20"/>
-        </w:rPr>
-        <w:t>print(</w:t>
-      </w:r>
-      <w:proofErr w:type="gramEnd"/>
-      <w:r>
-        <w:rPr>
-          <w:rFonts w:ascii="Courier New" w:hAnsi="Courier New" w:cs="Courier New"/>
-          <w:sz w:val="20"/>
-          <w:szCs w:val="20"/>
-        </w:rPr>
-        <w:t>"Error reserva:", e)</w:t>
-      </w:r>
-    </w:p>
-    <w:p>
-      <w:pPr>
-        <w:spacing w:line="480" w:lineRule="auto"/>
-        <w:rPr>
-          <w:rFonts w:ascii="Courier New" w:hAnsi="Courier New" w:cs="Courier New"/>
-          <w:sz w:val="20"/>
-          <w:szCs w:val="20"/>
-        </w:rPr>
-      </w:pPr>
-      <w:r>
-        <w:rPr>
-          <w:rFonts w:ascii="Courier New" w:hAnsi="Courier New" w:cs="Courier New"/>
-          <w:sz w:val="20"/>
-          <w:szCs w:val="20"/>
-        </w:rPr>
-        <w:t>    guardar_</w:t>
-      </w:r>
-      <w:proofErr w:type="gramStart"/>
-      <w:r>
-        <w:rPr>
-          <w:rFonts w:ascii="Courier New" w:hAnsi="Courier New" w:cs="Courier New"/>
-          <w:sz w:val="20"/>
-          <w:szCs w:val="20"/>
-        </w:rPr>
-        <w:t>error(</w:t>
-      </w:r>
-      <w:proofErr w:type="gramEnd"/>
-      <w:r>
-        <w:rPr>
-          <w:rFonts w:ascii="Courier New" w:hAnsi="Courier New" w:cs="Courier New"/>
-          <w:sz w:val="20"/>
-          <w:szCs w:val="20"/>
-        </w:rPr>
-        <w:t>"Error reserva: " + str(e))</w:t>
-      </w:r>
-    </w:p>
-    <w:p>
-      <w:pPr>
-        <w:spacing w:line="480" w:lineRule="auto"/>
-        <w:rPr>
-          <w:rFonts w:ascii="Courier New" w:hAnsi="Courier New" w:cs="Courier New"/>
-          <w:sz w:val="20"/>
-          <w:szCs w:val="20"/>
-        </w:rPr>
-      </w:pPr>
-      <w:r>
-        <w:rPr>
-          <w:rFonts w:ascii="Courier New" w:hAnsi="Courier New" w:cs="Courier New"/>
-          <w:sz w:val="20"/>
-          <w:szCs w:val="20"/>
-        </w:rPr>
-        <w:t>finally:</w:t>
-      </w:r>
-    </w:p>
-    <w:p>
-      <w:pPr>
-        <w:spacing w:line="480" w:lineRule="auto"/>
-        <w:rPr>
-          <w:rFonts w:ascii="Courier New" w:hAnsi="Courier New" w:cs="Courier New"/>
-          <w:sz w:val="20"/>
-          <w:szCs w:val="20"/>
-        </w:rPr>
-      </w:pPr>
-      <w:r>
-        <w:rPr>
-          <w:rFonts w:ascii="Courier New" w:hAnsi="Courier New" w:cs="Courier New"/>
-          <w:sz w:val="20"/>
-          <w:szCs w:val="20"/>
-        </w:rPr>
-        <w:t xml:space="preserve">    </w:t>
-      </w:r>
-      <w:proofErr w:type="gramStart"/>
-      <w:r>
-        <w:rPr>
-          <w:rFonts w:ascii="Courier New" w:hAnsi="Courier New" w:cs="Courier New"/>
-          <w:sz w:val="20"/>
-          <w:szCs w:val="20"/>
-        </w:rPr>
-        <w:t>print(</w:t>
-      </w:r>
-      <w:proofErr w:type="gramEnd"/>
-      <w:r>
-        <w:rPr>
-          <w:rFonts w:ascii="Courier New" w:hAnsi="Courier New" w:cs="Courier New"/>
-          <w:sz w:val="20"/>
-          <w:szCs w:val="20"/>
-        </w:rPr>
-        <w:t>"Proceso de reservas finalizado\n")</w:t>
-      </w:r>
-    </w:p>
-    <w:p>
-      <w:pPr>
-        <w:spacing w:line="480" w:lineRule="auto"/>
-        <w:rPr>
-          <w:rFonts w:ascii="Courier New" w:hAnsi="Courier New" w:cs="Courier New"/>
-          <w:sz w:val="20"/>
-          <w:szCs w:val="20"/>
-        </w:rPr>
-      </w:pPr>
-      <w:r>
-        <w:rPr>
-          <w:rFonts w:ascii="Courier New" w:hAnsi="Courier New" w:cs="Courier New"/>
-          <w:sz w:val="20"/>
-          <w:szCs w:val="20"/>
-        </w:rPr>
-        <w:t># ----------- MOSTRAR RESULTADOS -----------</w:t>
-      </w:r>
-    </w:p>
-    <w:p>
-      <w:pPr>
-        <w:spacing w:line="480" w:lineRule="auto"/>
-        <w:rPr>
-          <w:rFonts w:ascii="Courier New" w:hAnsi="Courier New" w:cs="Courier New"/>
-          <w:sz w:val="20"/>
-          <w:szCs w:val="20"/>
-        </w:rPr>
-      </w:pPr>
-      <w:proofErr w:type="gramStart"/>
-      <w:r>
-        <w:rPr>
-          <w:rFonts w:ascii="Courier New" w:hAnsi="Courier New" w:cs="Courier New"/>
-          <w:sz w:val="20"/>
-          <w:szCs w:val="20"/>
-        </w:rPr>
-        <w:t>print(</w:t>
-      </w:r>
-      <w:proofErr w:type="gramEnd"/>
-      <w:r>
-        <w:rPr>
-          <w:rFonts w:ascii="Courier New" w:hAnsi="Courier New" w:cs="Courier New"/>
-          <w:sz w:val="20"/>
-          <w:szCs w:val="20"/>
-        </w:rPr>
-        <w:t>"--- RESERVAS VALIDAS ---\n")</w:t>
-      </w:r>
-    </w:p>
-    <w:p>
-      <w:pPr>
-        <w:spacing w:line="480" w:lineRule="auto"/>
-        <w:rPr>
-          <w:rFonts w:ascii="Courier New" w:hAnsi="Courier New" w:cs="Courier New"/>
-          <w:sz w:val="20"/>
-          <w:szCs w:val="20"/>
-        </w:rPr>
-      </w:pPr>
-      <w:r>
-        <w:rPr>
-          <w:rFonts w:ascii="Courier New" w:hAnsi="Courier New" w:cs="Courier New"/>
-          <w:sz w:val="20"/>
-          <w:szCs w:val="20"/>
-        </w:rPr>
-        <w:t>for r in reservas:</w:t>
-      </w:r>
-    </w:p>
-    <w:p>
-      <w:pPr>
-        <w:spacing w:line="480" w:lineRule="auto"/>
-        <w:rPr>
-          <w:rFonts w:ascii="Courier New" w:hAnsi="Courier New" w:cs="Courier New"/>
-          <w:sz w:val="20"/>
-          <w:szCs w:val="20"/>
-          <w:lang w:val="en-US"/>
-        </w:rPr>
-      </w:pPr>
-      <w:r>
-        <w:rPr>
-          <w:rFonts w:ascii="Courier New" w:hAnsi="Courier New" w:cs="Courier New"/>
-          <w:sz w:val="20"/>
-          <w:szCs w:val="20"/>
-        </w:rPr>
-        <w:t xml:space="preserve">    </w:t>
-      </w:r>
-      <w:r>
-        <w:rPr>
-          <w:rFonts w:ascii="Courier New" w:hAnsi="Courier New" w:cs="Courier New"/>
-          <w:sz w:val="20"/>
-          <w:szCs w:val="20"/>
           <w:lang w:val="en-US"/>
         </w:rPr>
         <w:t>try:</w:t>
@@ -5296,27 +3811,7 @@
           <w:szCs w:val="20"/>
           <w:lang w:val="en-US"/>
         </w:rPr>
-        <w:t>        print(</w:t>
-      </w:r>
-      <w:proofErr w:type="gramStart"/>
-      <w:r>
-        <w:rPr>
-          <w:rFonts w:ascii="Courier New" w:hAnsi="Courier New" w:cs="Courier New"/>
-          <w:sz w:val="20"/>
-          <w:szCs w:val="20"/>
-          <w:lang w:val="en-US"/>
-        </w:rPr>
-        <w:t>r.procesar</w:t>
-      </w:r>
-      <w:proofErr w:type="gramEnd"/>
-      <w:r>
-        <w:rPr>
-          <w:rFonts w:ascii="Courier New" w:hAnsi="Courier New" w:cs="Courier New"/>
-          <w:sz w:val="20"/>
-          <w:szCs w:val="20"/>
-          <w:lang w:val="en-US"/>
-        </w:rPr>
-        <w:t>())</w:t>
+        <w:t>        print(r.procesar())</w:t>
       </w:r>
     </w:p>
     <w:p>
@@ -5358,87 +3853,49 @@
         </w:rPr>
         <w:t xml:space="preserve">        </w:t>
       </w:r>
-      <w:proofErr w:type="gramStart"/>
-      <w:r>
-        <w:rPr>
-          <w:rFonts w:ascii="Courier New" w:hAnsi="Courier New" w:cs="Courier New"/>
-          <w:sz w:val="20"/>
-          <w:szCs w:val="20"/>
-        </w:rPr>
-        <w:t>print(</w:t>
-      </w:r>
-      <w:proofErr w:type="gramEnd"/>
-      <w:r>
-        <w:rPr>
-          <w:rFonts w:ascii="Courier New" w:hAnsi="Courier New" w:cs="Courier New"/>
-          <w:sz w:val="20"/>
-          <w:szCs w:val="20"/>
-        </w:rPr>
-        <w:t>"Error al procesar:", e)</w:t>
-      </w:r>
-    </w:p>
-    <w:p>
-      <w:pPr>
-        <w:spacing w:line="480" w:lineRule="auto"/>
-        <w:rPr>
-          <w:rFonts w:ascii="Courier New" w:hAnsi="Courier New" w:cs="Courier New"/>
-          <w:sz w:val="20"/>
-          <w:szCs w:val="20"/>
-        </w:rPr>
-      </w:pPr>
-      <w:r>
-        <w:rPr>
-          <w:rFonts w:ascii="Courier New" w:hAnsi="Courier New" w:cs="Courier New"/>
-          <w:sz w:val="20"/>
-          <w:szCs w:val="20"/>
-        </w:rPr>
-        <w:t>        guardar_</w:t>
-      </w:r>
-      <w:proofErr w:type="gramStart"/>
-      <w:r>
-        <w:rPr>
-          <w:rFonts w:ascii="Courier New" w:hAnsi="Courier New" w:cs="Courier New"/>
-          <w:sz w:val="20"/>
-          <w:szCs w:val="20"/>
-        </w:rPr>
-        <w:t>error(</w:t>
-      </w:r>
-      <w:proofErr w:type="gramEnd"/>
-      <w:r>
-        <w:rPr>
-          <w:rFonts w:ascii="Courier New" w:hAnsi="Courier New" w:cs="Courier New"/>
-          <w:sz w:val="20"/>
-          <w:szCs w:val="20"/>
-        </w:rPr>
-        <w:t>"Error al procesar: " + str(e))</w:t>
-      </w:r>
-    </w:p>
-    <w:p>
-      <w:pPr>
-        <w:spacing w:line="480" w:lineRule="auto"/>
-        <w:rPr>
-          <w:rFonts w:ascii="Courier New" w:hAnsi="Courier New" w:cs="Courier New"/>
-          <w:sz w:val="20"/>
-          <w:szCs w:val="20"/>
-        </w:rPr>
-      </w:pPr>
-      <w:proofErr w:type="gramStart"/>
-      <w:r>
-        <w:rPr>
-          <w:rFonts w:ascii="Courier New" w:hAnsi="Courier New" w:cs="Courier New"/>
-          <w:sz w:val="20"/>
-          <w:szCs w:val="20"/>
-        </w:rPr>
-        <w:t>print(</w:t>
-      </w:r>
-      <w:proofErr w:type="gramEnd"/>
-      <w:r>
-        <w:rPr>
-          <w:rFonts w:ascii="Courier New" w:hAnsi="Courier New" w:cs="Courier New"/>
-          <w:sz w:val="20"/>
-          <w:szCs w:val="20"/>
-        </w:rPr>
-        <w:t>"\n--- FIN DEL SISTEMA ---")</w:t>
+      <w:r>
+        <w:rPr>
+          <w:rFonts w:ascii="Courier New" w:hAnsi="Courier New" w:cs="Courier New"/>
+          <w:sz w:val="20"/>
+          <w:szCs w:val="20"/>
+        </w:rPr>
+        <w:t>print("Error al procesar:", e)</w:t>
+      </w:r>
+    </w:p>
+    <w:p>
+      <w:pPr>
+        <w:spacing w:line="480" w:lineRule="auto"/>
+        <w:rPr>
+          <w:rFonts w:ascii="Courier New" w:hAnsi="Courier New" w:cs="Courier New"/>
+          <w:sz w:val="20"/>
+          <w:szCs w:val="20"/>
+        </w:rPr>
+      </w:pPr>
+      <w:r>
+        <w:rPr>
+          <w:rFonts w:ascii="Courier New" w:hAnsi="Courier New" w:cs="Courier New"/>
+          <w:sz w:val="20"/>
+          <w:szCs w:val="20"/>
+        </w:rPr>
+        <w:t>        guardar_error("Error al procesar: " + str(e))</w:t>
+      </w:r>
+    </w:p>
+    <w:p>
+      <w:pPr>
+        <w:spacing w:line="480" w:lineRule="auto"/>
+        <w:rPr>
+          <w:rFonts w:ascii="Courier New" w:hAnsi="Courier New" w:cs="Courier New"/>
+          <w:sz w:val="20"/>
+          <w:szCs w:val="20"/>
+        </w:rPr>
+      </w:pPr>
+      <w:r>
+        <w:rPr>
+          <w:rFonts w:ascii="Courier New" w:hAnsi="Courier New" w:cs="Courier New"/>
+          <w:sz w:val="20"/>
+          <w:szCs w:val="20"/>
+        </w:rPr>
+        <w:t>print("\n--- FIN DEL SISTEMA ---")</w:t>
       </w:r>
     </w:p>
     <w:p>
@@ -5739,6 +4196,43 @@
           <w:szCs w:val="24"/>
         </w:rPr>
       </w:pPr>
+      <w:r>
+        <w:rPr>
+          <w:rFonts w:ascii="Times New Roman" w:hAnsi="Times New Roman" w:cs="Times New Roman"/>
+          <w:sz w:val="24"/>
+          <w:szCs w:val="24"/>
+        </w:rPr>
+        <w:t>Repositorio GitHub</w:t>
+      </w:r>
+      <w:r>
+        <w:rPr>
+          <w:rFonts w:ascii="Times New Roman" w:hAnsi="Times New Roman" w:cs="Times New Roman"/>
+          <w:sz w:val="24"/>
+          <w:szCs w:val="24"/>
+        </w:rPr>
+        <w:t>:</w:t>
+      </w:r>
+    </w:p>
+    <w:p>
+      <w:pPr>
+        <w:spacing w:line="480" w:lineRule="auto"/>
+        <w:rPr>
+          <w:rFonts w:ascii="Times New Roman" w:hAnsi="Times New Roman" w:cs="Times New Roman"/>
+          <w:sz w:val="24"/>
+          <w:szCs w:val="24"/>
+        </w:rPr>
+      </w:pPr>
+      <w:hyperlink r:id="rId8" w:history="1">
+        <w:r>
+          <w:rPr>
+            <w:rStyle w:val="Hipervnculo"/>
+            <w:rFonts w:ascii="Times New Roman" w:hAnsi="Times New Roman" w:cs="Times New Roman"/>
+            <w:sz w:val="24"/>
+            <w:szCs w:val="24"/>
+          </w:rPr>
+          <w:t>https://github.com/jgrodriguezbo/Sistema_Reservas_Fase4</w:t>
+        </w:r>
+      </w:hyperlink>
     </w:p>
     <w:p>
       <w:pPr>
@@ -5786,7 +4280,6 @@
           <w:sz w:val="24"/>
           <w:szCs w:val="24"/>
         </w:rPr>
-        <w:lastRenderedPageBreak/>
         <w:t>Conclusión</w:t>
       </w:r>
     </w:p>
@@ -5962,7 +4455,6 @@
           <w:szCs w:val="24"/>
           <w:lang w:val="en-US"/>
         </w:rPr>
-        <w:lastRenderedPageBreak/>
         <w:t>Referencias Bibliográficas</w:t>
       </w:r>
     </w:p>
@@ -5985,7 +4477,7 @@
         </w:rPr>
         <w:t xml:space="preserve">Python Software Foundation. (2023). Python documentation. </w:t>
       </w:r>
-      <w:hyperlink r:id="rId8" w:history="1">
+      <w:hyperlink r:id="rId9" w:history="1">
         <w:r>
           <w:rPr>
             <w:rStyle w:val="Hipervnculo"/>

</xml_diff>